<commit_message>
mejora en el indice y enlace de referencia del repositorio
</commit_message>
<xml_diff>
--- a/caso_practico_2_APA_formato_3.docx
+++ b/caso_practico_2_APA_formato_3.docx
@@ -100,7 +100,6 @@
     </w:p>
     <w:p>
       <w:pPr>
-        <w:spacing w:line="480" w:lineRule="auto"/>
         <w:jc w:val="center"/>
       </w:pPr>
       <w:r>
@@ -109,7 +108,6 @@
     </w:p>
     <w:p>
       <w:pPr>
-        <w:spacing w:line="480" w:lineRule="auto"/>
         <w:jc w:val="center"/>
       </w:pPr>
       <w:r>
@@ -118,7 +116,6 @@
     </w:p>
     <w:p>
       <w:pPr>
-        <w:spacing w:line="480" w:lineRule="auto"/>
         <w:jc w:val="center"/>
       </w:pPr>
       <w:r>
@@ -127,7 +124,6 @@
     </w:p>
     <w:p>
       <w:pPr>
-        <w:spacing w:line="480" w:lineRule="auto"/>
         <w:jc w:val="center"/>
       </w:pPr>
       <w:proofErr w:type="spellStart"/>
@@ -137,96 +133,6 @@
       <w:proofErr w:type="spellEnd"/>
       <w:r>
         <w:t xml:space="preserve"> Mueses Ruiz</w:t>
-      </w:r>
-    </w:p>
-    <w:p>
-      <w:pPr>
-        <w:spacing w:line="480" w:lineRule="auto"/>
-      </w:pPr>
-    </w:p>
-    <w:p>
-      <w:pPr>
-        <w:spacing w:line="480" w:lineRule="auto"/>
-      </w:pPr>
-    </w:p>
-    <w:p>
-      <w:pPr>
-        <w:spacing w:line="480" w:lineRule="auto"/>
-        <w:jc w:val="center"/>
-      </w:pPr>
-      <w:proofErr w:type="spellStart"/>
-      <w:r>
-        <w:t>Asignación</w:t>
-      </w:r>
-      <w:proofErr w:type="spellEnd"/>
-      <w:r>
-        <w:t xml:space="preserve"> </w:t>
-      </w:r>
-      <w:proofErr w:type="spellStart"/>
-      <w:r>
-        <w:t>Presentada</w:t>
-      </w:r>
-      <w:proofErr w:type="spellEnd"/>
-      <w:r>
-        <w:t xml:space="preserve"> a la</w:t>
-      </w:r>
-    </w:p>
-    <w:p>
-      <w:pPr>
-        <w:spacing w:line="480" w:lineRule="auto"/>
-        <w:jc w:val="center"/>
-      </w:pPr>
-      <w:r>
-        <w:t xml:space="preserve">Escuela de </w:t>
-      </w:r>
-      <w:proofErr w:type="spellStart"/>
-      <w:r>
-        <w:t>Informática</w:t>
-      </w:r>
-      <w:proofErr w:type="spellEnd"/>
-      <w:r>
-        <w:t xml:space="preserve">, </w:t>
-      </w:r>
-      <w:proofErr w:type="spellStart"/>
-      <w:r>
-        <w:t>Facultad</w:t>
-      </w:r>
-      <w:proofErr w:type="spellEnd"/>
-      <w:r>
-        <w:t xml:space="preserve"> de </w:t>
-      </w:r>
-      <w:proofErr w:type="spellStart"/>
-      <w:r>
-        <w:t>Ciencias</w:t>
-      </w:r>
-      <w:proofErr w:type="spellEnd"/>
-      <w:r>
-        <w:t xml:space="preserve">, Como </w:t>
-      </w:r>
-      <w:proofErr w:type="spellStart"/>
-      <w:r>
-        <w:t>Cumplimiento</w:t>
-      </w:r>
-      <w:proofErr w:type="spellEnd"/>
-      <w:r>
-        <w:t xml:space="preserve"> del </w:t>
-      </w:r>
-      <w:proofErr w:type="spellStart"/>
-      <w:r>
-        <w:t>Curso</w:t>
-      </w:r>
-      <w:proofErr w:type="spellEnd"/>
-      <w:r>
-        <w:t xml:space="preserve"> "Ciencia de Datos I", Unidad 2,</w:t>
-      </w:r>
-    </w:p>
-    <w:p>
-      <w:pPr>
-        <w:spacing w:line="480" w:lineRule="auto"/>
-        <w:jc w:val="center"/>
-      </w:pPr>
-      <w:r>
-        <w:t>Dr. Silverio del Orbe Abad.</w:t>
       </w:r>
     </w:p>
     <w:p>
@@ -247,23 +153,128 @@
     <w:p>
       <w:pPr>
         <w:spacing w:line="480" w:lineRule="auto"/>
+      </w:pPr>
+    </w:p>
+    <w:p>
+      <w:pPr>
         <w:jc w:val="center"/>
       </w:pPr>
-      <w:r>
-        <w:t xml:space="preserve">Universidad </w:t>
-      </w:r>
-      <w:proofErr w:type="spellStart"/>
-      <w:r>
-        <w:t>Autónoma</w:t>
-      </w:r>
-      <w:proofErr w:type="spellEnd"/>
-      <w:r>
-        <w:t xml:space="preserve"> de Santo Domingo (UASD)</w:t>
+      <w:proofErr w:type="spellStart"/>
+      <w:r>
+        <w:t>Asignación</w:t>
+      </w:r>
+      <w:proofErr w:type="spellEnd"/>
+      <w:r>
+        <w:t xml:space="preserve"> </w:t>
+      </w:r>
+      <w:proofErr w:type="spellStart"/>
+      <w:r>
+        <w:t>Presentada</w:t>
+      </w:r>
+      <w:proofErr w:type="spellEnd"/>
+      <w:r>
+        <w:t xml:space="preserve"> a la</w:t>
+      </w:r>
+    </w:p>
+    <w:p>
+      <w:pPr>
+        <w:jc w:val="center"/>
+      </w:pPr>
+      <w:r>
+        <w:t xml:space="preserve">Escuela de </w:t>
+      </w:r>
+      <w:proofErr w:type="spellStart"/>
+      <w:r>
+        <w:t>Informática</w:t>
+      </w:r>
+      <w:proofErr w:type="spellEnd"/>
+      <w:r>
+        <w:t xml:space="preserve">, </w:t>
+      </w:r>
+      <w:proofErr w:type="spellStart"/>
+      <w:r>
+        <w:t>Facultad</w:t>
+      </w:r>
+      <w:proofErr w:type="spellEnd"/>
+      <w:r>
+        <w:t xml:space="preserve"> de </w:t>
+      </w:r>
+      <w:proofErr w:type="spellStart"/>
+      <w:r>
+        <w:t>Ciencias</w:t>
+      </w:r>
+      <w:proofErr w:type="spellEnd"/>
+      <w:r>
+        <w:t xml:space="preserve">, Como </w:t>
+      </w:r>
+      <w:proofErr w:type="spellStart"/>
+      <w:r>
+        <w:t>Cumplimiento</w:t>
+      </w:r>
+      <w:proofErr w:type="spellEnd"/>
+      <w:r>
+        <w:t xml:space="preserve"> del </w:t>
+      </w:r>
+      <w:proofErr w:type="spellStart"/>
+      <w:r>
+        <w:t>Curso</w:t>
+      </w:r>
+      <w:proofErr w:type="spellEnd"/>
+      <w:r>
+        <w:t xml:space="preserve"> "Ciencia de Datos I" (INF-8237 C2),</w:t>
+      </w:r>
+    </w:p>
+    <w:p>
+      <w:pPr>
+        <w:jc w:val="center"/>
+      </w:pPr>
+      <w:r>
+        <w:t>Dr. Silverio del Orbe Abad.</w:t>
       </w:r>
     </w:p>
     <w:p>
       <w:pPr>
         <w:spacing w:line="480" w:lineRule="auto"/>
+      </w:pPr>
+    </w:p>
+    <w:p>
+      <w:pPr>
+        <w:spacing w:line="480" w:lineRule="auto"/>
+      </w:pPr>
+    </w:p>
+    <w:p>
+      <w:pPr>
+        <w:spacing w:line="480" w:lineRule="auto"/>
+      </w:pPr>
+    </w:p>
+    <w:p>
+      <w:pPr>
+        <w:spacing w:line="480" w:lineRule="auto"/>
+      </w:pPr>
+    </w:p>
+    <w:p>
+      <w:pPr>
+        <w:jc w:val="center"/>
+      </w:pPr>
+    </w:p>
+    <w:p>
+      <w:pPr>
+        <w:jc w:val="center"/>
+      </w:pPr>
+      <w:r>
+        <w:t xml:space="preserve">Universidad </w:t>
+      </w:r>
+      <w:proofErr w:type="spellStart"/>
+      <w:r>
+        <w:t>Autónoma</w:t>
+      </w:r>
+      <w:proofErr w:type="spellEnd"/>
+      <w:r>
+        <w:t xml:space="preserve"> de Santo Domingo (UASD)</w:t>
+      </w:r>
+    </w:p>
+    <w:p>
+      <w:pPr>
         <w:jc w:val="center"/>
       </w:pPr>
       <w:r>
@@ -287,7 +298,7 @@
     </w:p>
     <w:p>
       <w:pPr>
-        <w:spacing w:line="480" w:lineRule="auto"/>
+        <w:spacing w:after="240" w:line="480" w:lineRule="auto"/>
         <w:jc w:val="center"/>
       </w:pPr>
       <w:proofErr w:type="spellStart"/>
@@ -317,1431 +328,709 @@
       </w:r>
       <w:proofErr w:type="spellEnd"/>
     </w:p>
-    <w:sdt>
-      <w:sdtPr>
-        <w:alias w:val="Tabla de Contenido"/>
-        <w:id w:val="-1368363766"/>
-      </w:sdtPr>
-      <w:sdtContent>
-        <w:p>
-          <w:pPr>
-            <w:pStyle w:val="TOC1"/>
-            <w:tabs>
-              <w:tab w:val="right" w:leader="dot" w:pos="8630"/>
-            </w:tabs>
-            <w:rPr>
-              <w:noProof/>
-            </w:rPr>
-          </w:pPr>
-          <w:r>
-            <w:fldChar w:fldCharType="begin"/>
-          </w:r>
-          <w:r>
-            <w:instrText>TOC \h \o "1-3"</w:instrText>
-          </w:r>
-          <w:r>
-            <w:fldChar w:fldCharType="separate"/>
-          </w:r>
-          <w:hyperlink w:anchor="_Toc231153927" w:history="1">
-            <w:r>
-              <w:rPr>
-                <w:rStyle w:val="Hyperlink"/>
-                <w:noProof/>
-              </w:rPr>
-              <w:t>Resumen</w:t>
-            </w:r>
-            <w:r>
-              <w:rPr>
-                <w:noProof/>
-              </w:rPr>
-              <w:tab/>
-            </w:r>
-            <w:r>
-              <w:rPr>
-                <w:noProof/>
-              </w:rPr>
-              <w:fldChar w:fldCharType="begin"/>
-            </w:r>
-            <w:r>
-              <w:rPr>
-                <w:noProof/>
-              </w:rPr>
-              <w:instrText xml:space="preserve"> PAGEREF _Toc231153927 \h </w:instrText>
-            </w:r>
-            <w:r>
-              <w:rPr>
-                <w:noProof/>
-              </w:rPr>
-            </w:r>
-            <w:r>
-              <w:rPr>
-                <w:noProof/>
-              </w:rPr>
-              <w:fldChar w:fldCharType="separate"/>
-            </w:r>
-            <w:r>
-              <w:rPr>
-                <w:noProof/>
-              </w:rPr>
-              <w:t>1</w:t>
-            </w:r>
-            <w:r>
-              <w:rPr>
-                <w:noProof/>
-              </w:rPr>
-              <w:fldChar w:fldCharType="end"/>
-            </w:r>
-          </w:hyperlink>
-        </w:p>
-        <w:p>
-          <w:pPr>
-            <w:pStyle w:val="TOC1"/>
-            <w:tabs>
-              <w:tab w:val="right" w:leader="dot" w:pos="8630"/>
-            </w:tabs>
-            <w:rPr>
-              <w:noProof/>
-            </w:rPr>
-          </w:pPr>
-          <w:hyperlink w:anchor="_Toc231153928" w:history="1">
-            <w:r>
-              <w:rPr>
-                <w:rStyle w:val="Hyperlink"/>
-                <w:noProof/>
-              </w:rPr>
-              <w:t>Introducción</w:t>
-            </w:r>
-            <w:r>
-              <w:rPr>
-                <w:noProof/>
-              </w:rPr>
-              <w:tab/>
-            </w:r>
-            <w:r>
-              <w:rPr>
-                <w:noProof/>
-              </w:rPr>
-              <w:fldChar w:fldCharType="begin"/>
-            </w:r>
-            <w:r>
-              <w:rPr>
-                <w:noProof/>
-              </w:rPr>
-              <w:instrText xml:space="preserve"> PAGEREF _Toc231153928 \h </w:instrText>
-            </w:r>
-            <w:r>
-              <w:rPr>
-                <w:noProof/>
-              </w:rPr>
-            </w:r>
-            <w:r>
-              <w:rPr>
-                <w:noProof/>
-              </w:rPr>
-              <w:fldChar w:fldCharType="separate"/>
-            </w:r>
-            <w:r>
-              <w:rPr>
-                <w:noProof/>
-              </w:rPr>
-              <w:t>1</w:t>
-            </w:r>
-            <w:r>
-              <w:rPr>
-                <w:noProof/>
-              </w:rPr>
-              <w:fldChar w:fldCharType="end"/>
-            </w:r>
-          </w:hyperlink>
-        </w:p>
-        <w:p>
-          <w:pPr>
-            <w:pStyle w:val="TOC1"/>
-            <w:tabs>
-              <w:tab w:val="right" w:leader="dot" w:pos="8630"/>
-            </w:tabs>
-            <w:rPr>
-              <w:noProof/>
-            </w:rPr>
-          </w:pPr>
-          <w:hyperlink w:anchor="_Toc231153929" w:history="1">
-            <w:r>
-              <w:rPr>
-                <w:rStyle w:val="Hyperlink"/>
-                <w:noProof/>
-              </w:rPr>
-              <w:t>Fase I: CRUD Básico y Consultas SQL</w:t>
-            </w:r>
-            <w:r>
-              <w:rPr>
-                <w:noProof/>
-              </w:rPr>
-              <w:tab/>
-            </w:r>
-            <w:r>
-              <w:rPr>
-                <w:noProof/>
-              </w:rPr>
-              <w:fldChar w:fldCharType="begin"/>
-            </w:r>
-            <w:r>
-              <w:rPr>
-                <w:noProof/>
-              </w:rPr>
-              <w:instrText xml:space="preserve"> PAGEREF _Toc231153929 \h </w:instrText>
-            </w:r>
-            <w:r>
-              <w:rPr>
-                <w:noProof/>
-              </w:rPr>
-            </w:r>
-            <w:r>
-              <w:rPr>
-                <w:noProof/>
-              </w:rPr>
-              <w:fldChar w:fldCharType="separate"/>
-            </w:r>
-            <w:r>
-              <w:rPr>
-                <w:noProof/>
-              </w:rPr>
-              <w:t>1</w:t>
-            </w:r>
-            <w:r>
-              <w:rPr>
-                <w:noProof/>
-              </w:rPr>
-              <w:fldChar w:fldCharType="end"/>
-            </w:r>
-          </w:hyperlink>
-        </w:p>
-        <w:p>
-          <w:pPr>
-            <w:pStyle w:val="TOC2"/>
-            <w:tabs>
-              <w:tab w:val="right" w:leader="dot" w:pos="8630"/>
-            </w:tabs>
-            <w:rPr>
-              <w:noProof/>
-            </w:rPr>
-          </w:pPr>
-          <w:hyperlink w:anchor="_Toc231153930" w:history="1">
-            <w:r>
-              <w:rPr>
-                <w:rStyle w:val="Hyperlink"/>
-                <w:noProof/>
-              </w:rPr>
-              <w:t>Configuración del Entorno</w:t>
-            </w:r>
-            <w:r>
-              <w:rPr>
-                <w:noProof/>
-              </w:rPr>
-              <w:tab/>
-            </w:r>
-            <w:r>
-              <w:rPr>
-                <w:noProof/>
-              </w:rPr>
-              <w:fldChar w:fldCharType="begin"/>
-            </w:r>
-            <w:r>
-              <w:rPr>
-                <w:noProof/>
-              </w:rPr>
-              <w:instrText xml:space="preserve"> PAGEREF _Toc231153930 \h </w:instrText>
-            </w:r>
-            <w:r>
-              <w:rPr>
-                <w:noProof/>
-              </w:rPr>
-            </w:r>
-            <w:r>
-              <w:rPr>
-                <w:noProof/>
-              </w:rPr>
-              <w:fldChar w:fldCharType="separate"/>
-            </w:r>
-            <w:r>
-              <w:rPr>
-                <w:noProof/>
-              </w:rPr>
-              <w:t>1</w:t>
-            </w:r>
-            <w:r>
-              <w:rPr>
-                <w:noProof/>
-              </w:rPr>
-              <w:fldChar w:fldCharType="end"/>
-            </w:r>
-          </w:hyperlink>
-        </w:p>
-        <w:p>
-          <w:pPr>
-            <w:pStyle w:val="TOC2"/>
-            <w:tabs>
-              <w:tab w:val="right" w:leader="dot" w:pos="8630"/>
-            </w:tabs>
-            <w:rPr>
-              <w:noProof/>
-            </w:rPr>
-          </w:pPr>
-          <w:hyperlink w:anchor="_Toc231153931" w:history="1">
-            <w:r>
-              <w:rPr>
-                <w:rStyle w:val="Hyperlink"/>
-                <w:noProof/>
-              </w:rPr>
-              <w:t>Consultas SQL (Q1–Q10)</w:t>
-            </w:r>
-            <w:r>
-              <w:rPr>
-                <w:noProof/>
-              </w:rPr>
-              <w:tab/>
-            </w:r>
-            <w:r>
-              <w:rPr>
-                <w:noProof/>
-              </w:rPr>
-              <w:fldChar w:fldCharType="begin"/>
-            </w:r>
-            <w:r>
-              <w:rPr>
-                <w:noProof/>
-              </w:rPr>
-              <w:instrText xml:space="preserve"> PAGEREF _Toc231153931 \h </w:instrText>
-            </w:r>
-            <w:r>
-              <w:rPr>
-                <w:noProof/>
-              </w:rPr>
-            </w:r>
-            <w:r>
-              <w:rPr>
-                <w:noProof/>
-              </w:rPr>
-              <w:fldChar w:fldCharType="separate"/>
-            </w:r>
-            <w:r>
-              <w:rPr>
-                <w:noProof/>
-              </w:rPr>
-              <w:t>1</w:t>
-            </w:r>
-            <w:r>
-              <w:rPr>
-                <w:noProof/>
-              </w:rPr>
-              <w:fldChar w:fldCharType="end"/>
-            </w:r>
-          </w:hyperlink>
-        </w:p>
-        <w:p>
-          <w:pPr>
-            <w:pStyle w:val="TOC2"/>
-            <w:tabs>
-              <w:tab w:val="right" w:leader="dot" w:pos="8630"/>
-            </w:tabs>
-            <w:rPr>
-              <w:noProof/>
-            </w:rPr>
-          </w:pPr>
-          <w:hyperlink w:anchor="_Toc231153932" w:history="1">
-            <w:r>
-              <w:rPr>
-                <w:rStyle w:val="Hyperlink"/>
-                <w:noProof/>
-              </w:rPr>
-              <w:t>CRUD Básico en Python</w:t>
-            </w:r>
-            <w:r>
-              <w:rPr>
-                <w:noProof/>
-              </w:rPr>
-              <w:tab/>
-            </w:r>
-            <w:r>
-              <w:rPr>
-                <w:noProof/>
-              </w:rPr>
-              <w:fldChar w:fldCharType="begin"/>
-            </w:r>
-            <w:r>
-              <w:rPr>
-                <w:noProof/>
-              </w:rPr>
-              <w:instrText xml:space="preserve"> PAGEREF _Toc231153932 \h </w:instrText>
-            </w:r>
-            <w:r>
-              <w:rPr>
-                <w:noProof/>
-              </w:rPr>
-            </w:r>
-            <w:r>
-              <w:rPr>
-                <w:noProof/>
-              </w:rPr>
-              <w:fldChar w:fldCharType="separate"/>
-            </w:r>
-            <w:r>
-              <w:rPr>
-                <w:noProof/>
-              </w:rPr>
-              <w:t>1</w:t>
-            </w:r>
-            <w:r>
-              <w:rPr>
-                <w:noProof/>
-              </w:rPr>
-              <w:fldChar w:fldCharType="end"/>
-            </w:r>
-          </w:hyperlink>
-        </w:p>
-        <w:p>
-          <w:pPr>
-            <w:pStyle w:val="TOC3"/>
-            <w:tabs>
-              <w:tab w:val="right" w:leader="dot" w:pos="8630"/>
-            </w:tabs>
-            <w:rPr>
-              <w:noProof/>
-            </w:rPr>
-          </w:pPr>
-          <w:hyperlink w:anchor="_Toc231153933" w:history="1">
-            <w:r>
-              <w:rPr>
-                <w:rStyle w:val="Hyperlink"/>
-                <w:noProof/>
-              </w:rPr>
-              <w:t>Estructura de las funciones CRUD</w:t>
-            </w:r>
-            <w:r>
-              <w:rPr>
-                <w:noProof/>
-              </w:rPr>
-              <w:tab/>
-            </w:r>
-            <w:r>
-              <w:rPr>
-                <w:noProof/>
-              </w:rPr>
-              <w:fldChar w:fldCharType="begin"/>
-            </w:r>
-            <w:r>
-              <w:rPr>
-                <w:noProof/>
-              </w:rPr>
-              <w:instrText xml:space="preserve"> PAGEREF _Toc231153933 \h </w:instrText>
-            </w:r>
-            <w:r>
-              <w:rPr>
-                <w:noProof/>
-              </w:rPr>
-            </w:r>
-            <w:r>
-              <w:rPr>
-                <w:noProof/>
-              </w:rPr>
-              <w:fldChar w:fldCharType="separate"/>
-            </w:r>
-            <w:r>
-              <w:rPr>
-                <w:noProof/>
-              </w:rPr>
-              <w:t>1</w:t>
-            </w:r>
-            <w:r>
-              <w:rPr>
-                <w:noProof/>
-              </w:rPr>
-              <w:fldChar w:fldCharType="end"/>
-            </w:r>
-          </w:hyperlink>
-        </w:p>
-        <w:p>
-          <w:pPr>
-            <w:pStyle w:val="TOC3"/>
-            <w:tabs>
-              <w:tab w:val="right" w:leader="dot" w:pos="8630"/>
-            </w:tabs>
-            <w:rPr>
-              <w:noProof/>
-            </w:rPr>
-          </w:pPr>
-          <w:hyperlink w:anchor="_Toc231153934" w:history="1">
-            <w:r>
-              <w:rPr>
-                <w:rStyle w:val="Hyperlink"/>
-                <w:noProof/>
-              </w:rPr>
-              <w:t>Importación y exportación CSV / JSON</w:t>
-            </w:r>
-            <w:r>
-              <w:rPr>
-                <w:noProof/>
-              </w:rPr>
-              <w:tab/>
-            </w:r>
-            <w:r>
-              <w:rPr>
-                <w:noProof/>
-              </w:rPr>
-              <w:fldChar w:fldCharType="begin"/>
-            </w:r>
-            <w:r>
-              <w:rPr>
-                <w:noProof/>
-              </w:rPr>
-              <w:instrText xml:space="preserve"> PAGEREF _Toc231153934 \h </w:instrText>
-            </w:r>
-            <w:r>
-              <w:rPr>
-                <w:noProof/>
-              </w:rPr>
-            </w:r>
-            <w:r>
-              <w:rPr>
-                <w:noProof/>
-              </w:rPr>
-              <w:fldChar w:fldCharType="separate"/>
-            </w:r>
-            <w:r>
-              <w:rPr>
-                <w:noProof/>
-              </w:rPr>
-              <w:t>1</w:t>
-            </w:r>
-            <w:r>
-              <w:rPr>
-                <w:noProof/>
-              </w:rPr>
-              <w:fldChar w:fldCharType="end"/>
-            </w:r>
-          </w:hyperlink>
-        </w:p>
-        <w:p>
-          <w:pPr>
-            <w:pStyle w:val="TOC3"/>
-            <w:tabs>
-              <w:tab w:val="right" w:leader="dot" w:pos="8630"/>
-            </w:tabs>
-            <w:rPr>
-              <w:noProof/>
-            </w:rPr>
-          </w:pPr>
-          <w:hyperlink w:anchor="_Toc231153935" w:history="1">
-            <w:r>
-              <w:rPr>
-                <w:rStyle w:val="Hyperlink"/>
-                <w:noProof/>
-              </w:rPr>
-              <w:t>Métricas descriptivas</w:t>
-            </w:r>
-            <w:r>
-              <w:rPr>
-                <w:noProof/>
-              </w:rPr>
-              <w:tab/>
-            </w:r>
-            <w:r>
-              <w:rPr>
-                <w:noProof/>
-              </w:rPr>
-              <w:fldChar w:fldCharType="begin"/>
-            </w:r>
-            <w:r>
-              <w:rPr>
-                <w:noProof/>
-              </w:rPr>
-              <w:instrText xml:space="preserve"> PAGEREF _Toc231153935 \h </w:instrText>
-            </w:r>
-            <w:r>
-              <w:rPr>
-                <w:noProof/>
-              </w:rPr>
-            </w:r>
-            <w:r>
-              <w:rPr>
-                <w:noProof/>
-              </w:rPr>
-              <w:fldChar w:fldCharType="separate"/>
-            </w:r>
-            <w:r>
-              <w:rPr>
-                <w:noProof/>
-              </w:rPr>
-              <w:t>1</w:t>
-            </w:r>
-            <w:r>
-              <w:rPr>
-                <w:noProof/>
-              </w:rPr>
-              <w:fldChar w:fldCharType="end"/>
-            </w:r>
-          </w:hyperlink>
-        </w:p>
-        <w:p>
-          <w:pPr>
-            <w:pStyle w:val="TOC2"/>
-            <w:tabs>
-              <w:tab w:val="right" w:leader="dot" w:pos="8630"/>
-            </w:tabs>
-            <w:rPr>
-              <w:noProof/>
-            </w:rPr>
-          </w:pPr>
-          <w:hyperlink w:anchor="_Toc231153936" w:history="1">
-            <w:r>
-              <w:rPr>
-                <w:rStyle w:val="Hyperlink"/>
-                <w:noProof/>
-              </w:rPr>
-              <w:t>Mejora de Integridad: UNIQUE Constraints</w:t>
-            </w:r>
-            <w:r>
-              <w:rPr>
-                <w:noProof/>
-              </w:rPr>
-              <w:tab/>
-            </w:r>
-            <w:r>
-              <w:rPr>
-                <w:noProof/>
-              </w:rPr>
-              <w:fldChar w:fldCharType="begin"/>
-            </w:r>
-            <w:r>
-              <w:rPr>
-                <w:noProof/>
-              </w:rPr>
-              <w:instrText xml:space="preserve"> PAGEREF _Toc231153936 \h </w:instrText>
-            </w:r>
-            <w:r>
-              <w:rPr>
-                <w:noProof/>
-              </w:rPr>
-            </w:r>
-            <w:r>
-              <w:rPr>
-                <w:noProof/>
-              </w:rPr>
-              <w:fldChar w:fldCharType="separate"/>
-            </w:r>
-            <w:r>
-              <w:rPr>
-                <w:noProof/>
-              </w:rPr>
-              <w:t>1</w:t>
-            </w:r>
-            <w:r>
-              <w:rPr>
-                <w:noProof/>
-              </w:rPr>
-              <w:fldChar w:fldCharType="end"/>
-            </w:r>
-          </w:hyperlink>
-        </w:p>
-        <w:p>
-          <w:pPr>
-            <w:pStyle w:val="TOC1"/>
-            <w:tabs>
-              <w:tab w:val="right" w:leader="dot" w:pos="8630"/>
-            </w:tabs>
-            <w:rPr>
-              <w:noProof/>
-            </w:rPr>
-          </w:pPr>
-          <w:hyperlink w:anchor="_Toc231153937" w:history="1">
-            <w:r>
-              <w:rPr>
-                <w:rStyle w:val="Hyperlink"/>
-                <w:noProof/>
-              </w:rPr>
-              <w:t>Fase II: ORM Nativo en POO</w:t>
-            </w:r>
-            <w:r>
-              <w:rPr>
-                <w:noProof/>
-              </w:rPr>
-              <w:tab/>
-            </w:r>
-            <w:r>
-              <w:rPr>
-                <w:noProof/>
-              </w:rPr>
-              <w:fldChar w:fldCharType="begin"/>
-            </w:r>
-            <w:r>
-              <w:rPr>
-                <w:noProof/>
-              </w:rPr>
-              <w:instrText xml:space="preserve"> PAGEREF _Toc231153937 \h </w:instrText>
-            </w:r>
-            <w:r>
-              <w:rPr>
-                <w:noProof/>
-              </w:rPr>
-            </w:r>
-            <w:r>
-              <w:rPr>
-                <w:noProof/>
-              </w:rPr>
-              <w:fldChar w:fldCharType="separate"/>
-            </w:r>
-            <w:r>
-              <w:rPr>
-                <w:noProof/>
-              </w:rPr>
-              <w:t>1</w:t>
-            </w:r>
-            <w:r>
-              <w:rPr>
-                <w:noProof/>
-              </w:rPr>
-              <w:fldChar w:fldCharType="end"/>
-            </w:r>
-          </w:hyperlink>
-        </w:p>
-        <w:p>
-          <w:pPr>
-            <w:pStyle w:val="TOC2"/>
-            <w:tabs>
-              <w:tab w:val="right" w:leader="dot" w:pos="8630"/>
-            </w:tabs>
-            <w:rPr>
-              <w:noProof/>
-            </w:rPr>
-          </w:pPr>
-          <w:hyperlink w:anchor="_Toc231153938" w:history="1">
-            <w:r>
-              <w:rPr>
-                <w:rStyle w:val="Hyperlink"/>
-                <w:noProof/>
-              </w:rPr>
-              <w:t>Arquitectura de la Solución</w:t>
-            </w:r>
-            <w:r>
-              <w:rPr>
-                <w:noProof/>
-              </w:rPr>
-              <w:tab/>
-            </w:r>
-            <w:r>
-              <w:rPr>
-                <w:noProof/>
-              </w:rPr>
-              <w:fldChar w:fldCharType="begin"/>
-            </w:r>
-            <w:r>
-              <w:rPr>
-                <w:noProof/>
-              </w:rPr>
-              <w:instrText xml:space="preserve"> PAGEREF _Toc231153938 \h </w:instrText>
-            </w:r>
-            <w:r>
-              <w:rPr>
-                <w:noProof/>
-              </w:rPr>
-            </w:r>
-            <w:r>
-              <w:rPr>
-                <w:noProof/>
-              </w:rPr>
-              <w:fldChar w:fldCharType="separate"/>
-            </w:r>
-            <w:r>
-              <w:rPr>
-                <w:noProof/>
-              </w:rPr>
-              <w:t>1</w:t>
-            </w:r>
-            <w:r>
-              <w:rPr>
-                <w:noProof/>
-              </w:rPr>
-              <w:fldChar w:fldCharType="end"/>
-            </w:r>
-          </w:hyperlink>
-        </w:p>
-        <w:p>
-          <w:pPr>
-            <w:pStyle w:val="TOC2"/>
-            <w:tabs>
-              <w:tab w:val="right" w:leader="dot" w:pos="8630"/>
-            </w:tabs>
-            <w:rPr>
-              <w:noProof/>
-            </w:rPr>
-          </w:pPr>
-          <w:hyperlink w:anchor="_Toc231153939" w:history="1">
-            <w:r>
-              <w:rPr>
-                <w:rStyle w:val="Hyperlink"/>
-                <w:noProof/>
-              </w:rPr>
-              <w:t>DbContext</w:t>
-            </w:r>
-            <w:r>
-              <w:rPr>
-                <w:noProof/>
-              </w:rPr>
-              <w:tab/>
-            </w:r>
-            <w:r>
-              <w:rPr>
-                <w:noProof/>
-              </w:rPr>
-              <w:fldChar w:fldCharType="begin"/>
-            </w:r>
-            <w:r>
-              <w:rPr>
-                <w:noProof/>
-              </w:rPr>
-              <w:instrText xml:space="preserve"> PAGEREF _Toc231153939 \h </w:instrText>
-            </w:r>
-            <w:r>
-              <w:rPr>
-                <w:noProof/>
-              </w:rPr>
-            </w:r>
-            <w:r>
-              <w:rPr>
-                <w:noProof/>
-              </w:rPr>
-              <w:fldChar w:fldCharType="separate"/>
-            </w:r>
-            <w:r>
-              <w:rPr>
-                <w:noProof/>
-              </w:rPr>
-              <w:t>1</w:t>
-            </w:r>
-            <w:r>
-              <w:rPr>
-                <w:noProof/>
-              </w:rPr>
-              <w:fldChar w:fldCharType="end"/>
-            </w:r>
-          </w:hyperlink>
-        </w:p>
-        <w:p>
-          <w:pPr>
-            <w:pStyle w:val="TOC2"/>
-            <w:tabs>
-              <w:tab w:val="right" w:leader="dot" w:pos="8630"/>
-            </w:tabs>
-            <w:rPr>
-              <w:noProof/>
-            </w:rPr>
-          </w:pPr>
-          <w:hyperlink w:anchor="_Toc231153940" w:history="1">
-            <w:r>
-              <w:rPr>
-                <w:rStyle w:val="Hyperlink"/>
-                <w:noProof/>
-              </w:rPr>
-              <w:t>Entities</w:t>
-            </w:r>
-            <w:r>
-              <w:rPr>
-                <w:noProof/>
-              </w:rPr>
-              <w:tab/>
-            </w:r>
-            <w:r>
-              <w:rPr>
-                <w:noProof/>
-              </w:rPr>
-              <w:fldChar w:fldCharType="begin"/>
-            </w:r>
-            <w:r>
-              <w:rPr>
-                <w:noProof/>
-              </w:rPr>
-              <w:instrText xml:space="preserve"> PAGEREF _Toc231153940 \h </w:instrText>
-            </w:r>
-            <w:r>
-              <w:rPr>
-                <w:noProof/>
-              </w:rPr>
-            </w:r>
-            <w:r>
-              <w:rPr>
-                <w:noProof/>
-              </w:rPr>
-              <w:fldChar w:fldCharType="separate"/>
-            </w:r>
-            <w:r>
-              <w:rPr>
-                <w:noProof/>
-              </w:rPr>
-              <w:t>1</w:t>
-            </w:r>
-            <w:r>
-              <w:rPr>
-                <w:noProof/>
-              </w:rPr>
-              <w:fldChar w:fldCharType="end"/>
-            </w:r>
-          </w:hyperlink>
-        </w:p>
-        <w:p>
-          <w:pPr>
-            <w:pStyle w:val="TOC2"/>
-            <w:tabs>
-              <w:tab w:val="right" w:leader="dot" w:pos="8630"/>
-            </w:tabs>
-            <w:rPr>
-              <w:noProof/>
-            </w:rPr>
-          </w:pPr>
-          <w:hyperlink w:anchor="_Toc231153941" w:history="1">
-            <w:r>
-              <w:rPr>
-                <w:rStyle w:val="Hyperlink"/>
-                <w:noProof/>
-              </w:rPr>
-              <w:t>Repositories (List&lt;Entity&gt;)</w:t>
-            </w:r>
-            <w:r>
-              <w:rPr>
-                <w:noProof/>
-              </w:rPr>
-              <w:tab/>
-            </w:r>
-            <w:r>
-              <w:rPr>
-                <w:noProof/>
-              </w:rPr>
-              <w:fldChar w:fldCharType="begin"/>
-            </w:r>
-            <w:r>
-              <w:rPr>
-                <w:noProof/>
-              </w:rPr>
-              <w:instrText xml:space="preserve"> PAGEREF _Toc231153941 \h </w:instrText>
-            </w:r>
-            <w:r>
-              <w:rPr>
-                <w:noProof/>
-              </w:rPr>
-            </w:r>
-            <w:r>
-              <w:rPr>
-                <w:noProof/>
-              </w:rPr>
-              <w:fldChar w:fldCharType="separate"/>
-            </w:r>
-            <w:r>
-              <w:rPr>
-                <w:noProof/>
-              </w:rPr>
-              <w:t>1</w:t>
-            </w:r>
-            <w:r>
-              <w:rPr>
-                <w:noProof/>
-              </w:rPr>
-              <w:fldChar w:fldCharType="end"/>
-            </w:r>
-          </w:hyperlink>
-        </w:p>
-        <w:p>
-          <w:pPr>
-            <w:pStyle w:val="TOC2"/>
-            <w:tabs>
-              <w:tab w:val="right" w:leader="dot" w:pos="8630"/>
-            </w:tabs>
-            <w:rPr>
-              <w:noProof/>
-            </w:rPr>
-          </w:pPr>
-          <w:hyperlink w:anchor="_Toc231153942" w:history="1">
-            <w:r>
-              <w:rPr>
-                <w:rStyle w:val="Hyperlink"/>
-                <w:noProof/>
-              </w:rPr>
-              <w:t>Controllers (MVC)</w:t>
-            </w:r>
-            <w:r>
-              <w:rPr>
-                <w:noProof/>
-              </w:rPr>
-              <w:tab/>
-            </w:r>
-            <w:r>
-              <w:rPr>
-                <w:noProof/>
-              </w:rPr>
-              <w:fldChar w:fldCharType="begin"/>
-            </w:r>
-            <w:r>
-              <w:rPr>
-                <w:noProof/>
-              </w:rPr>
-              <w:instrText xml:space="preserve"> PAGEREF _Toc231153942 \h </w:instrText>
-            </w:r>
-            <w:r>
-              <w:rPr>
-                <w:noProof/>
-              </w:rPr>
-            </w:r>
-            <w:r>
-              <w:rPr>
-                <w:noProof/>
-              </w:rPr>
-              <w:fldChar w:fldCharType="separate"/>
-            </w:r>
-            <w:r>
-              <w:rPr>
-                <w:noProof/>
-              </w:rPr>
-              <w:t>1</w:t>
-            </w:r>
-            <w:r>
-              <w:rPr>
-                <w:noProof/>
-              </w:rPr>
-              <w:fldChar w:fldCharType="end"/>
-            </w:r>
-          </w:hyperlink>
-        </w:p>
-        <w:p>
-          <w:pPr>
-            <w:pStyle w:val="TOC2"/>
-            <w:tabs>
-              <w:tab w:val="right" w:leader="dot" w:pos="8630"/>
-            </w:tabs>
-            <w:rPr>
-              <w:noProof/>
-            </w:rPr>
-          </w:pPr>
-          <w:hyperlink w:anchor="_Toc231153943" w:history="1">
-            <w:r>
-              <w:rPr>
-                <w:rStyle w:val="Hyperlink"/>
-                <w:noProof/>
-              </w:rPr>
-              <w:t>Flujo Completo de una Operación</w:t>
-            </w:r>
-            <w:r>
-              <w:rPr>
-                <w:noProof/>
-              </w:rPr>
-              <w:tab/>
-            </w:r>
-            <w:r>
-              <w:rPr>
-                <w:noProof/>
-              </w:rPr>
-              <w:fldChar w:fldCharType="begin"/>
-            </w:r>
-            <w:r>
-              <w:rPr>
-                <w:noProof/>
-              </w:rPr>
-              <w:instrText xml:space="preserve"> PAGEREF _Toc231153943 \h </w:instrText>
-            </w:r>
-            <w:r>
-              <w:rPr>
-                <w:noProof/>
-              </w:rPr>
-            </w:r>
-            <w:r>
-              <w:rPr>
-                <w:noProof/>
-              </w:rPr>
-              <w:fldChar w:fldCharType="separate"/>
-            </w:r>
-            <w:r>
-              <w:rPr>
-                <w:noProof/>
-              </w:rPr>
-              <w:t>1</w:t>
-            </w:r>
-            <w:r>
-              <w:rPr>
-                <w:noProof/>
-              </w:rPr>
-              <w:fldChar w:fldCharType="end"/>
-            </w:r>
-          </w:hyperlink>
-        </w:p>
-        <w:p>
-          <w:pPr>
-            <w:pStyle w:val="TOC1"/>
-            <w:tabs>
-              <w:tab w:val="right" w:leader="dot" w:pos="8630"/>
-            </w:tabs>
-            <w:rPr>
-              <w:noProof/>
-            </w:rPr>
-          </w:pPr>
-          <w:hyperlink w:anchor="_Toc231153944" w:history="1">
-            <w:r>
-              <w:rPr>
-                <w:rStyle w:val="Hyperlink"/>
-                <w:noProof/>
-              </w:rPr>
-              <w:t>Resultados</w:t>
-            </w:r>
-            <w:r>
-              <w:rPr>
-                <w:noProof/>
-              </w:rPr>
-              <w:tab/>
-            </w:r>
-            <w:r>
-              <w:rPr>
-                <w:noProof/>
-              </w:rPr>
-              <w:fldChar w:fldCharType="begin"/>
-            </w:r>
-            <w:r>
-              <w:rPr>
-                <w:noProof/>
-              </w:rPr>
-              <w:instrText xml:space="preserve"> PAGEREF _Toc231153944 \h </w:instrText>
-            </w:r>
-            <w:r>
-              <w:rPr>
-                <w:noProof/>
-              </w:rPr>
-            </w:r>
-            <w:r>
-              <w:rPr>
-                <w:noProof/>
-              </w:rPr>
-              <w:fldChar w:fldCharType="separate"/>
-            </w:r>
-            <w:r>
-              <w:rPr>
-                <w:noProof/>
-              </w:rPr>
-              <w:t>1</w:t>
-            </w:r>
-            <w:r>
-              <w:rPr>
-                <w:noProof/>
-              </w:rPr>
-              <w:fldChar w:fldCharType="end"/>
-            </w:r>
-          </w:hyperlink>
-        </w:p>
-        <w:p>
-          <w:pPr>
-            <w:pStyle w:val="TOC2"/>
-            <w:tabs>
-              <w:tab w:val="right" w:leader="dot" w:pos="8630"/>
-            </w:tabs>
-            <w:rPr>
-              <w:noProof/>
-            </w:rPr>
-          </w:pPr>
-          <w:hyperlink w:anchor="_Toc231153945" w:history="1">
-            <w:r>
-              <w:rPr>
-                <w:rStyle w:val="Hyperlink"/>
-                <w:noProof/>
-              </w:rPr>
-              <w:t>Estructura del Proyecto</w:t>
-            </w:r>
-            <w:r>
-              <w:rPr>
-                <w:noProof/>
-              </w:rPr>
-              <w:tab/>
-            </w:r>
-            <w:r>
-              <w:rPr>
-                <w:noProof/>
-              </w:rPr>
-              <w:fldChar w:fldCharType="begin"/>
-            </w:r>
-            <w:r>
-              <w:rPr>
-                <w:noProof/>
-              </w:rPr>
-              <w:instrText xml:space="preserve"> PAGEREF _Toc231153945 \h </w:instrText>
-            </w:r>
-            <w:r>
-              <w:rPr>
-                <w:noProof/>
-              </w:rPr>
-            </w:r>
-            <w:r>
-              <w:rPr>
-                <w:noProof/>
-              </w:rPr>
-              <w:fldChar w:fldCharType="separate"/>
-            </w:r>
-            <w:r>
-              <w:rPr>
-                <w:noProof/>
-              </w:rPr>
-              <w:t>1</w:t>
-            </w:r>
-            <w:r>
-              <w:rPr>
-                <w:noProof/>
-              </w:rPr>
-              <w:fldChar w:fldCharType="end"/>
-            </w:r>
-          </w:hyperlink>
-        </w:p>
-        <w:p>
-          <w:pPr>
-            <w:pStyle w:val="TOC1"/>
-            <w:tabs>
-              <w:tab w:val="right" w:leader="dot" w:pos="8630"/>
-            </w:tabs>
-            <w:rPr>
-              <w:noProof/>
-            </w:rPr>
-          </w:pPr>
-          <w:hyperlink w:anchor="_Toc231153946" w:history="1">
-            <w:r>
-              <w:rPr>
-                <w:rStyle w:val="Hyperlink"/>
-                <w:noProof/>
-              </w:rPr>
-              <w:t>Conclusiones y Recomendaciones</w:t>
-            </w:r>
-            <w:r>
-              <w:rPr>
-                <w:noProof/>
-              </w:rPr>
-              <w:tab/>
-            </w:r>
-            <w:r>
-              <w:rPr>
-                <w:noProof/>
-              </w:rPr>
-              <w:fldChar w:fldCharType="begin"/>
-            </w:r>
-            <w:r>
-              <w:rPr>
-                <w:noProof/>
-              </w:rPr>
-              <w:instrText xml:space="preserve"> PAGEREF _Toc231153946 \h </w:instrText>
-            </w:r>
-            <w:r>
-              <w:rPr>
-                <w:noProof/>
-              </w:rPr>
-            </w:r>
-            <w:r>
-              <w:rPr>
-                <w:noProof/>
-              </w:rPr>
-              <w:fldChar w:fldCharType="separate"/>
-            </w:r>
-            <w:r>
-              <w:rPr>
-                <w:noProof/>
-              </w:rPr>
-              <w:t>1</w:t>
-            </w:r>
-            <w:r>
-              <w:rPr>
-                <w:noProof/>
-              </w:rPr>
-              <w:fldChar w:fldCharType="end"/>
-            </w:r>
-          </w:hyperlink>
-        </w:p>
-        <w:p>
-          <w:pPr>
-            <w:pStyle w:val="TOC1"/>
-            <w:tabs>
-              <w:tab w:val="right" w:leader="dot" w:pos="8630"/>
-            </w:tabs>
-            <w:rPr>
-              <w:noProof/>
-            </w:rPr>
-          </w:pPr>
-          <w:hyperlink w:anchor="_Toc231153947" w:history="1">
-            <w:r>
-              <w:rPr>
-                <w:rStyle w:val="Hyperlink"/>
-                <w:noProof/>
-              </w:rPr>
-              <w:t>Referencias</w:t>
-            </w:r>
-            <w:r>
-              <w:rPr>
-                <w:noProof/>
-              </w:rPr>
-              <w:tab/>
-            </w:r>
-            <w:r>
-              <w:rPr>
-                <w:noProof/>
-              </w:rPr>
-              <w:fldChar w:fldCharType="begin"/>
-            </w:r>
-            <w:r>
-              <w:rPr>
-                <w:noProof/>
-              </w:rPr>
-              <w:instrText xml:space="preserve"> PAGEREF _Toc231153947 \h </w:instrText>
-            </w:r>
-            <w:r>
-              <w:rPr>
-                <w:noProof/>
-              </w:rPr>
-            </w:r>
-            <w:r>
-              <w:rPr>
-                <w:noProof/>
-              </w:rPr>
-              <w:fldChar w:fldCharType="separate"/>
-            </w:r>
-            <w:r>
-              <w:rPr>
-                <w:noProof/>
-              </w:rPr>
-              <w:t>1</w:t>
-            </w:r>
-            <w:r>
-              <w:rPr>
-                <w:noProof/>
-              </w:rPr>
-              <w:fldChar w:fldCharType="end"/>
-            </w:r>
-          </w:hyperlink>
-        </w:p>
-        <w:p>
-          <w:pPr>
-            <w:pStyle w:val="TOC1"/>
-            <w:tabs>
-              <w:tab w:val="right" w:leader="dot" w:pos="8630"/>
-            </w:tabs>
-            <w:rPr>
-              <w:noProof/>
-            </w:rPr>
-          </w:pPr>
-          <w:hyperlink w:anchor="_Toc231153948" w:history="1">
-            <w:r>
-              <w:rPr>
-                <w:rStyle w:val="Hyperlink"/>
-                <w:noProof/>
-              </w:rPr>
-              <w:t>Anexo A: Repositorio y Código Fuente</w:t>
-            </w:r>
-            <w:r>
-              <w:rPr>
-                <w:noProof/>
-              </w:rPr>
-              <w:tab/>
-            </w:r>
-            <w:r>
-              <w:rPr>
-                <w:noProof/>
-              </w:rPr>
-              <w:fldChar w:fldCharType="begin"/>
-            </w:r>
-            <w:r>
-              <w:rPr>
-                <w:noProof/>
-              </w:rPr>
-              <w:instrText xml:space="preserve"> PAGEREF _Toc231153948 \h </w:instrText>
-            </w:r>
-            <w:r>
-              <w:rPr>
-                <w:noProof/>
-              </w:rPr>
-            </w:r>
-            <w:r>
-              <w:rPr>
-                <w:noProof/>
-              </w:rPr>
-              <w:fldChar w:fldCharType="separate"/>
-            </w:r>
-            <w:r>
-              <w:rPr>
-                <w:noProof/>
-              </w:rPr>
-              <w:t>1</w:t>
-            </w:r>
-            <w:r>
-              <w:rPr>
-                <w:noProof/>
-              </w:rPr>
-              <w:fldChar w:fldCharType="end"/>
-            </w:r>
-          </w:hyperlink>
-        </w:p>
-        <w:p>
-          <w:pPr>
-            <w:pStyle w:val="TOC1"/>
-            <w:tabs>
-              <w:tab w:val="right" w:leader="dot" w:pos="8630"/>
-            </w:tabs>
-            <w:rPr>
-              <w:noProof/>
-            </w:rPr>
-          </w:pPr>
-          <w:hyperlink w:anchor="_Toc231153949" w:history="1">
-            <w:r>
-              <w:rPr>
-                <w:rStyle w:val="Hyperlink"/>
-                <w:noProof/>
-              </w:rPr>
-              <w:t>Anexo B: Instrucciones de Ejecución</w:t>
-            </w:r>
-            <w:r>
-              <w:rPr>
-                <w:noProof/>
-              </w:rPr>
-              <w:tab/>
-            </w:r>
-            <w:r>
-              <w:rPr>
-                <w:noProof/>
-              </w:rPr>
-              <w:fldChar w:fldCharType="begin"/>
-            </w:r>
-            <w:r>
-              <w:rPr>
-                <w:noProof/>
-              </w:rPr>
-              <w:instrText xml:space="preserve"> PAGEREF _Toc231153949 \h </w:instrText>
-            </w:r>
-            <w:r>
-              <w:rPr>
-                <w:noProof/>
-              </w:rPr>
-            </w:r>
-            <w:r>
-              <w:rPr>
-                <w:noProof/>
-              </w:rPr>
-              <w:fldChar w:fldCharType="separate"/>
-            </w:r>
-            <w:r>
-              <w:rPr>
-                <w:noProof/>
-              </w:rPr>
-              <w:t>1</w:t>
-            </w:r>
-            <w:r>
-              <w:rPr>
-                <w:noProof/>
-              </w:rPr>
-              <w:fldChar w:fldCharType="end"/>
-            </w:r>
-          </w:hyperlink>
-        </w:p>
-        <w:p>
-          <w:r>
-            <w:fldChar w:fldCharType="end"/>
-          </w:r>
-        </w:p>
-      </w:sdtContent>
-    </w:sdt>
+    <w:p>
+      <w:pPr>
+        <w:tabs>
+          <w:tab w:val="right" w:leader="dot" w:pos="8640"/>
+        </w:tabs>
+        <w:spacing w:after="60" w:line="360" w:lineRule="auto"/>
+      </w:pPr>
+      <w:proofErr w:type="spellStart"/>
+      <w:r>
+        <w:rPr>
+          <w:b/>
+          <w:bCs/>
+        </w:rPr>
+        <w:t>Resumen</w:t>
+      </w:r>
+      <w:proofErr w:type="spellEnd"/>
+      <w:r>
+        <w:tab/>
+      </w:r>
+      <w:r>
+        <w:rPr>
+          <w:b/>
+          <w:bCs/>
+        </w:rPr>
+        <w:t>1</w:t>
+      </w:r>
+    </w:p>
+    <w:p>
+      <w:pPr>
+        <w:tabs>
+          <w:tab w:val="right" w:leader="dot" w:pos="8640"/>
+        </w:tabs>
+        <w:spacing w:after="60" w:line="360" w:lineRule="auto"/>
+      </w:pPr>
+      <w:proofErr w:type="spellStart"/>
+      <w:r>
+        <w:rPr>
+          <w:b/>
+          <w:bCs/>
+        </w:rPr>
+        <w:t>Introducción</w:t>
+      </w:r>
+      <w:proofErr w:type="spellEnd"/>
+      <w:r>
+        <w:tab/>
+      </w:r>
+      <w:r>
+        <w:rPr>
+          <w:b/>
+          <w:bCs/>
+        </w:rPr>
+        <w:t>2</w:t>
+      </w:r>
+    </w:p>
+    <w:p>
+      <w:pPr>
+        <w:tabs>
+          <w:tab w:val="right" w:leader="dot" w:pos="8640"/>
+        </w:tabs>
+        <w:spacing w:after="60" w:line="360" w:lineRule="auto"/>
+      </w:pPr>
+      <w:r>
+        <w:rPr>
+          <w:b/>
+          <w:bCs/>
+        </w:rPr>
+        <w:t xml:space="preserve">Fase I: CRUD </w:t>
+      </w:r>
+      <w:proofErr w:type="spellStart"/>
+      <w:r>
+        <w:rPr>
+          <w:b/>
+          <w:bCs/>
+        </w:rPr>
+        <w:t>Básico</w:t>
+      </w:r>
+      <w:proofErr w:type="spellEnd"/>
+      <w:r>
+        <w:rPr>
+          <w:b/>
+          <w:bCs/>
+        </w:rPr>
+        <w:t xml:space="preserve"> y </w:t>
+      </w:r>
+      <w:proofErr w:type="spellStart"/>
+      <w:r>
+        <w:rPr>
+          <w:b/>
+          <w:bCs/>
+        </w:rPr>
+        <w:t>Consultas</w:t>
+      </w:r>
+      <w:proofErr w:type="spellEnd"/>
+      <w:r>
+        <w:rPr>
+          <w:b/>
+          <w:bCs/>
+        </w:rPr>
+        <w:t xml:space="preserve"> SQL</w:t>
+      </w:r>
+      <w:r>
+        <w:tab/>
+      </w:r>
+      <w:r>
+        <w:rPr>
+          <w:b/>
+          <w:bCs/>
+        </w:rPr>
+        <w:t>3</w:t>
+      </w:r>
+    </w:p>
+    <w:p>
+      <w:pPr>
+        <w:tabs>
+          <w:tab w:val="right" w:leader="dot" w:pos="8640"/>
+        </w:tabs>
+        <w:spacing w:after="60" w:line="360" w:lineRule="auto"/>
+      </w:pPr>
+      <w:r>
+        <w:t xml:space="preserve">    </w:t>
+      </w:r>
+      <w:proofErr w:type="spellStart"/>
+      <w:r>
+        <w:t>Configuración</w:t>
+      </w:r>
+      <w:proofErr w:type="spellEnd"/>
+      <w:r>
+        <w:t xml:space="preserve"> del </w:t>
+      </w:r>
+      <w:proofErr w:type="spellStart"/>
+      <w:r>
+        <w:t>Entorno</w:t>
+      </w:r>
+      <w:proofErr w:type="spellEnd"/>
+      <w:r>
+        <w:tab/>
+        <w:t>3</w:t>
+      </w:r>
+    </w:p>
+    <w:p>
+      <w:pPr>
+        <w:tabs>
+          <w:tab w:val="right" w:leader="dot" w:pos="8640"/>
+        </w:tabs>
+        <w:spacing w:after="60" w:line="360" w:lineRule="auto"/>
+      </w:pPr>
+      <w:r>
+        <w:t xml:space="preserve">    </w:t>
+      </w:r>
+      <w:proofErr w:type="spellStart"/>
+      <w:r>
+        <w:t>Consultas</w:t>
+      </w:r>
+      <w:proofErr w:type="spellEnd"/>
+      <w:r>
+        <w:t xml:space="preserve"> SQL (Q1–Q10)</w:t>
+      </w:r>
+      <w:r>
+        <w:tab/>
+        <w:t>3</w:t>
+      </w:r>
+    </w:p>
+    <w:p>
+      <w:pPr>
+        <w:tabs>
+          <w:tab w:val="right" w:leader="dot" w:pos="8640"/>
+        </w:tabs>
+        <w:spacing w:after="60" w:line="360" w:lineRule="auto"/>
+      </w:pPr>
+      <w:r>
+        <w:t xml:space="preserve">    CRUD </w:t>
+      </w:r>
+      <w:proofErr w:type="spellStart"/>
+      <w:r>
+        <w:t>Básico</w:t>
+      </w:r>
+      <w:proofErr w:type="spellEnd"/>
+      <w:r>
+        <w:t xml:space="preserve"> </w:t>
+      </w:r>
+      <w:proofErr w:type="spellStart"/>
+      <w:r>
+        <w:t>en</w:t>
+      </w:r>
+      <w:proofErr w:type="spellEnd"/>
+      <w:r>
+        <w:t xml:space="preserve"> Python</w:t>
+      </w:r>
+      <w:r>
+        <w:tab/>
+        <w:t>4</w:t>
+      </w:r>
+    </w:p>
+    <w:p>
+      <w:pPr>
+        <w:tabs>
+          <w:tab w:val="right" w:leader="dot" w:pos="8640"/>
+        </w:tabs>
+        <w:spacing w:after="60" w:line="360" w:lineRule="auto"/>
+      </w:pPr>
+      <w:r>
+        <w:t xml:space="preserve">        </w:t>
+      </w:r>
+      <w:proofErr w:type="spellStart"/>
+      <w:r>
+        <w:t>Estructura</w:t>
+      </w:r>
+      <w:proofErr w:type="spellEnd"/>
+      <w:r>
+        <w:t xml:space="preserve"> de las </w:t>
+      </w:r>
+      <w:proofErr w:type="spellStart"/>
+      <w:r>
+        <w:t>funciones</w:t>
+      </w:r>
+      <w:proofErr w:type="spellEnd"/>
+      <w:r>
+        <w:t xml:space="preserve"> CRUD</w:t>
+      </w:r>
+      <w:r>
+        <w:tab/>
+        <w:t>4</w:t>
+      </w:r>
+    </w:p>
+    <w:p>
+      <w:pPr>
+        <w:tabs>
+          <w:tab w:val="right" w:leader="dot" w:pos="8640"/>
+        </w:tabs>
+        <w:spacing w:after="60" w:line="360" w:lineRule="auto"/>
+      </w:pPr>
+      <w:r>
+        <w:t xml:space="preserve">        </w:t>
+      </w:r>
+      <w:proofErr w:type="spellStart"/>
+      <w:r>
+        <w:t>Importación</w:t>
+      </w:r>
+      <w:proofErr w:type="spellEnd"/>
+      <w:r>
+        <w:t xml:space="preserve"> y </w:t>
+      </w:r>
+      <w:proofErr w:type="spellStart"/>
+      <w:r>
+        <w:t>exportación</w:t>
+      </w:r>
+      <w:proofErr w:type="spellEnd"/>
+      <w:r>
+        <w:t xml:space="preserve"> CSV / JSON</w:t>
+      </w:r>
+      <w:r>
+        <w:tab/>
+        <w:t>4</w:t>
+      </w:r>
+    </w:p>
+    <w:p>
+      <w:pPr>
+        <w:tabs>
+          <w:tab w:val="right" w:leader="dot" w:pos="8640"/>
+        </w:tabs>
+        <w:spacing w:after="60" w:line="360" w:lineRule="auto"/>
+      </w:pPr>
+      <w:r>
+        <w:t xml:space="preserve">        </w:t>
+      </w:r>
+      <w:proofErr w:type="spellStart"/>
+      <w:r>
+        <w:t>Métricas</w:t>
+      </w:r>
+      <w:proofErr w:type="spellEnd"/>
+      <w:r>
+        <w:t xml:space="preserve"> </w:t>
+      </w:r>
+      <w:proofErr w:type="spellStart"/>
+      <w:r>
+        <w:t>descriptivas</w:t>
+      </w:r>
+      <w:proofErr w:type="spellEnd"/>
+      <w:r>
+        <w:tab/>
+        <w:t>4</w:t>
+      </w:r>
+    </w:p>
+    <w:p>
+      <w:pPr>
+        <w:tabs>
+          <w:tab w:val="right" w:leader="dot" w:pos="8640"/>
+        </w:tabs>
+        <w:spacing w:after="60" w:line="360" w:lineRule="auto"/>
+      </w:pPr>
+      <w:r>
+        <w:t xml:space="preserve">    </w:t>
+      </w:r>
+      <w:proofErr w:type="spellStart"/>
+      <w:r>
+        <w:t>Mejora</w:t>
+      </w:r>
+      <w:proofErr w:type="spellEnd"/>
+      <w:r>
+        <w:t xml:space="preserve"> de </w:t>
+      </w:r>
+      <w:proofErr w:type="spellStart"/>
+      <w:r>
+        <w:t>Integridad</w:t>
+      </w:r>
+      <w:proofErr w:type="spellEnd"/>
+      <w:r>
+        <w:t>: UNIQUE Constraints</w:t>
+      </w:r>
+      <w:r>
+        <w:tab/>
+        <w:t>5</w:t>
+      </w:r>
+    </w:p>
+    <w:p>
+      <w:pPr>
+        <w:tabs>
+          <w:tab w:val="right" w:leader="dot" w:pos="8640"/>
+        </w:tabs>
+        <w:spacing w:after="60" w:line="360" w:lineRule="auto"/>
+      </w:pPr>
+      <w:r>
+        <w:rPr>
+          <w:b/>
+          <w:bCs/>
+        </w:rPr>
+        <w:t xml:space="preserve">Fase II: ORM Nativo </w:t>
+      </w:r>
+      <w:proofErr w:type="spellStart"/>
+      <w:r>
+        <w:rPr>
+          <w:b/>
+          <w:bCs/>
+        </w:rPr>
+        <w:t>en</w:t>
+      </w:r>
+      <w:proofErr w:type="spellEnd"/>
+      <w:r>
+        <w:rPr>
+          <w:b/>
+          <w:bCs/>
+        </w:rPr>
+        <w:t xml:space="preserve"> POO</w:t>
+      </w:r>
+      <w:r>
+        <w:tab/>
+      </w:r>
+      <w:r>
+        <w:rPr>
+          <w:b/>
+          <w:bCs/>
+        </w:rPr>
+        <w:t>5</w:t>
+      </w:r>
+    </w:p>
+    <w:p>
+      <w:pPr>
+        <w:tabs>
+          <w:tab w:val="right" w:leader="dot" w:pos="8640"/>
+        </w:tabs>
+        <w:spacing w:after="60" w:line="360" w:lineRule="auto"/>
+      </w:pPr>
+      <w:r>
+        <w:t xml:space="preserve">    </w:t>
+      </w:r>
+      <w:proofErr w:type="spellStart"/>
+      <w:r>
+        <w:t>Arquitectura</w:t>
+      </w:r>
+      <w:proofErr w:type="spellEnd"/>
+      <w:r>
+        <w:t xml:space="preserve"> de la </w:t>
+      </w:r>
+      <w:proofErr w:type="spellStart"/>
+      <w:r>
+        <w:t>Solución</w:t>
+      </w:r>
+      <w:proofErr w:type="spellEnd"/>
+      <w:r>
+        <w:tab/>
+        <w:t>5</w:t>
+      </w:r>
+    </w:p>
+    <w:p>
+      <w:pPr>
+        <w:tabs>
+          <w:tab w:val="right" w:leader="dot" w:pos="8640"/>
+        </w:tabs>
+        <w:spacing w:after="60" w:line="360" w:lineRule="auto"/>
+      </w:pPr>
+      <w:r>
+        <w:t xml:space="preserve">    </w:t>
+      </w:r>
+      <w:proofErr w:type="spellStart"/>
+      <w:r>
+        <w:t>DbContext</w:t>
+      </w:r>
+      <w:proofErr w:type="spellEnd"/>
+      <w:r>
+        <w:tab/>
+        <w:t>6</w:t>
+      </w:r>
+    </w:p>
+    <w:p>
+      <w:pPr>
+        <w:tabs>
+          <w:tab w:val="right" w:leader="dot" w:pos="8640"/>
+        </w:tabs>
+        <w:spacing w:after="60" w:line="360" w:lineRule="auto"/>
+      </w:pPr>
+      <w:r>
+        <w:t xml:space="preserve">    Entities</w:t>
+      </w:r>
+      <w:r>
+        <w:tab/>
+        <w:t>6</w:t>
+      </w:r>
+    </w:p>
+    <w:p>
+      <w:pPr>
+        <w:tabs>
+          <w:tab w:val="right" w:leader="dot" w:pos="8640"/>
+        </w:tabs>
+        <w:spacing w:after="60" w:line="360" w:lineRule="auto"/>
+      </w:pPr>
+      <w:r>
+        <w:t xml:space="preserve">    Repositories (List&lt;Entity&gt;)</w:t>
+      </w:r>
+      <w:r>
+        <w:tab/>
+        <w:t>7</w:t>
+      </w:r>
+    </w:p>
+    <w:p>
+      <w:pPr>
+        <w:tabs>
+          <w:tab w:val="right" w:leader="dot" w:pos="8640"/>
+        </w:tabs>
+        <w:spacing w:after="60" w:line="360" w:lineRule="auto"/>
+      </w:pPr>
+      <w:r>
+        <w:t xml:space="preserve">    Controllers (MVC)</w:t>
+      </w:r>
+      <w:r>
+        <w:tab/>
+        <w:t>7</w:t>
+      </w:r>
+    </w:p>
+    <w:p>
+      <w:pPr>
+        <w:tabs>
+          <w:tab w:val="right" w:leader="dot" w:pos="8640"/>
+        </w:tabs>
+        <w:spacing w:after="60" w:line="360" w:lineRule="auto"/>
+      </w:pPr>
+      <w:r>
+        <w:t xml:space="preserve">    </w:t>
+      </w:r>
+      <w:proofErr w:type="spellStart"/>
+      <w:r>
+        <w:t>Flujo</w:t>
+      </w:r>
+      <w:proofErr w:type="spellEnd"/>
+      <w:r>
+        <w:t xml:space="preserve"> </w:t>
+      </w:r>
+      <w:proofErr w:type="spellStart"/>
+      <w:r>
+        <w:t>Completo</w:t>
+      </w:r>
+      <w:proofErr w:type="spellEnd"/>
+      <w:r>
+        <w:t xml:space="preserve"> de </w:t>
+      </w:r>
+      <w:proofErr w:type="spellStart"/>
+      <w:r>
+        <w:t>una</w:t>
+      </w:r>
+      <w:proofErr w:type="spellEnd"/>
+      <w:r>
+        <w:t xml:space="preserve"> </w:t>
+      </w:r>
+      <w:proofErr w:type="spellStart"/>
+      <w:r>
+        <w:t>Operación</w:t>
+      </w:r>
+      <w:proofErr w:type="spellEnd"/>
+      <w:r>
+        <w:tab/>
+        <w:t>8</w:t>
+      </w:r>
+    </w:p>
+    <w:p>
+      <w:pPr>
+        <w:tabs>
+          <w:tab w:val="right" w:leader="dot" w:pos="8640"/>
+        </w:tabs>
+        <w:spacing w:after="60" w:line="360" w:lineRule="auto"/>
+      </w:pPr>
+      <w:proofErr w:type="spellStart"/>
+      <w:r>
+        <w:rPr>
+          <w:b/>
+          <w:bCs/>
+        </w:rPr>
+        <w:t>Resultados</w:t>
+      </w:r>
+      <w:proofErr w:type="spellEnd"/>
+      <w:r>
+        <w:tab/>
+      </w:r>
+      <w:r>
+        <w:rPr>
+          <w:b/>
+          <w:bCs/>
+        </w:rPr>
+        <w:t>8</w:t>
+      </w:r>
+    </w:p>
+    <w:p>
+      <w:pPr>
+        <w:tabs>
+          <w:tab w:val="right" w:leader="dot" w:pos="8640"/>
+        </w:tabs>
+        <w:spacing w:after="60" w:line="360" w:lineRule="auto"/>
+      </w:pPr>
+      <w:r>
+        <w:t xml:space="preserve">    </w:t>
+      </w:r>
+      <w:proofErr w:type="spellStart"/>
+      <w:r>
+        <w:t>Estructura</w:t>
+      </w:r>
+      <w:proofErr w:type="spellEnd"/>
+      <w:r>
+        <w:t xml:space="preserve"> del Proyecto</w:t>
+      </w:r>
+      <w:r>
+        <w:tab/>
+        <w:t>9</w:t>
+      </w:r>
+    </w:p>
+    <w:p>
+      <w:pPr>
+        <w:tabs>
+          <w:tab w:val="right" w:leader="dot" w:pos="8640"/>
+        </w:tabs>
+        <w:spacing w:after="60" w:line="360" w:lineRule="auto"/>
+      </w:pPr>
+      <w:proofErr w:type="spellStart"/>
+      <w:r>
+        <w:rPr>
+          <w:b/>
+          <w:bCs/>
+        </w:rPr>
+        <w:t>Conclusiones</w:t>
+      </w:r>
+      <w:proofErr w:type="spellEnd"/>
+      <w:r>
+        <w:rPr>
+          <w:b/>
+          <w:bCs/>
+        </w:rPr>
+        <w:t xml:space="preserve"> y </w:t>
+      </w:r>
+      <w:proofErr w:type="spellStart"/>
+      <w:r>
+        <w:rPr>
+          <w:b/>
+          <w:bCs/>
+        </w:rPr>
+        <w:t>Recomendaciones</w:t>
+      </w:r>
+      <w:proofErr w:type="spellEnd"/>
+      <w:r>
+        <w:tab/>
+      </w:r>
+      <w:r>
+        <w:rPr>
+          <w:b/>
+          <w:bCs/>
+        </w:rPr>
+        <w:t>9</w:t>
+      </w:r>
+    </w:p>
+    <w:p>
+      <w:pPr>
+        <w:tabs>
+          <w:tab w:val="right" w:leader="dot" w:pos="8640"/>
+        </w:tabs>
+        <w:spacing w:after="60" w:line="360" w:lineRule="auto"/>
+      </w:pPr>
+      <w:proofErr w:type="spellStart"/>
+      <w:r>
+        <w:rPr>
+          <w:b/>
+          <w:bCs/>
+        </w:rPr>
+        <w:t>Referencias</w:t>
+      </w:r>
+      <w:proofErr w:type="spellEnd"/>
+      <w:r>
+        <w:tab/>
+      </w:r>
+      <w:r>
+        <w:rPr>
+          <w:b/>
+          <w:bCs/>
+        </w:rPr>
+        <w:t>10</w:t>
+      </w:r>
+    </w:p>
+    <w:p>
+      <w:pPr>
+        <w:tabs>
+          <w:tab w:val="right" w:leader="dot" w:pos="8640"/>
+        </w:tabs>
+        <w:spacing w:after="60" w:line="360" w:lineRule="auto"/>
+      </w:pPr>
+      <w:r>
+        <w:rPr>
+          <w:b/>
+          <w:bCs/>
+        </w:rPr>
+        <w:t xml:space="preserve">Anexo A: </w:t>
+      </w:r>
+      <w:proofErr w:type="spellStart"/>
+      <w:r>
+        <w:rPr>
+          <w:b/>
+          <w:bCs/>
+        </w:rPr>
+        <w:t>Repositorio</w:t>
+      </w:r>
+      <w:proofErr w:type="spellEnd"/>
+      <w:r>
+        <w:rPr>
+          <w:b/>
+          <w:bCs/>
+        </w:rPr>
+        <w:t xml:space="preserve"> y Código Fuente</w:t>
+      </w:r>
+      <w:r>
+        <w:tab/>
+      </w:r>
+      <w:r>
+        <w:rPr>
+          <w:b/>
+          <w:bCs/>
+        </w:rPr>
+        <w:t>10</w:t>
+      </w:r>
+    </w:p>
+    <w:p>
+      <w:pPr>
+        <w:tabs>
+          <w:tab w:val="right" w:leader="dot" w:pos="8640"/>
+        </w:tabs>
+        <w:spacing w:after="60" w:line="360" w:lineRule="auto"/>
+      </w:pPr>
+      <w:r>
+        <w:rPr>
+          <w:b/>
+          <w:bCs/>
+        </w:rPr>
+        <w:t xml:space="preserve">Anexo B: </w:t>
+      </w:r>
+      <w:proofErr w:type="spellStart"/>
+      <w:r>
+        <w:rPr>
+          <w:b/>
+          <w:bCs/>
+        </w:rPr>
+        <w:t>Instrucciones</w:t>
+      </w:r>
+      <w:proofErr w:type="spellEnd"/>
+      <w:r>
+        <w:rPr>
+          <w:b/>
+          <w:bCs/>
+        </w:rPr>
+        <w:t xml:space="preserve"> de </w:t>
+      </w:r>
+      <w:proofErr w:type="spellStart"/>
+      <w:r>
+        <w:rPr>
+          <w:b/>
+          <w:bCs/>
+        </w:rPr>
+        <w:t>Ejecución</w:t>
+      </w:r>
+      <w:proofErr w:type="spellEnd"/>
+      <w:r>
+        <w:tab/>
+      </w:r>
+      <w:r>
+        <w:rPr>
+          <w:b/>
+          <w:bCs/>
+        </w:rPr>
+        <w:t>11</w:t>
+      </w:r>
+    </w:p>
     <w:p>
       <w:pPr>
         <w:sectPr>
@@ -1759,13 +1048,11 @@
       <w:pPr>
         <w:pStyle w:val="Heading1"/>
       </w:pPr>
-      <w:bookmarkStart w:id="0" w:name="_Toc231153927"/>
       <w:proofErr w:type="spellStart"/>
       <w:r>
         <w:lastRenderedPageBreak/>
         <w:t>Resumen</w:t>
       </w:r>
-      <w:bookmarkEnd w:id="0"/>
       <w:proofErr w:type="spellEnd"/>
     </w:p>
     <w:p>
@@ -3000,12 +2287,10 @@
       <w:pPr>
         <w:pStyle w:val="Heading1"/>
       </w:pPr>
-      <w:bookmarkStart w:id="1" w:name="_Toc231153928"/>
       <w:proofErr w:type="spellStart"/>
       <w:r>
         <w:t>Introducción</w:t>
       </w:r>
-      <w:bookmarkEnd w:id="1"/>
       <w:proofErr w:type="spellEnd"/>
     </w:p>
     <w:p>
@@ -4505,7 +3790,6 @@
       <w:pPr>
         <w:pStyle w:val="Heading1"/>
       </w:pPr>
-      <w:bookmarkStart w:id="2" w:name="_Toc231153929"/>
       <w:r>
         <w:t xml:space="preserve">Fase I: CRUD </w:t>
       </w:r>
@@ -4525,13 +3809,11 @@
       <w:r>
         <w:t xml:space="preserve"> SQL</w:t>
       </w:r>
-      <w:bookmarkEnd w:id="2"/>
     </w:p>
     <w:p>
       <w:pPr>
         <w:pStyle w:val="Heading2"/>
       </w:pPr>
-      <w:bookmarkStart w:id="3" w:name="_Toc231153930"/>
       <w:proofErr w:type="spellStart"/>
       <w:r>
         <w:t>Configuración</w:t>
@@ -4544,7 +3826,6 @@
       <w:r>
         <w:t>Entorno</w:t>
       </w:r>
-      <w:bookmarkEnd w:id="3"/>
       <w:proofErr w:type="spellEnd"/>
     </w:p>
     <w:p>
@@ -4777,7 +4058,6 @@
       <w:pPr>
         <w:pStyle w:val="Heading2"/>
       </w:pPr>
-      <w:bookmarkStart w:id="4" w:name="_Toc231153931"/>
       <w:proofErr w:type="spellStart"/>
       <w:r>
         <w:t>Consultas</w:t>
@@ -4786,7 +4066,6 @@
       <w:r>
         <w:t xml:space="preserve"> SQL (Q1–Q10)</w:t>
       </w:r>
-      <w:bookmarkEnd w:id="4"/>
     </w:p>
     <w:p>
       <w:pPr>
@@ -4946,7 +4225,7 @@
           <w:left w:w="10" w:type="dxa"/>
           <w:right w:w="10" w:type="dxa"/>
         </w:tblCellMar>
-        <w:tblLook w:val="04A0" w:firstRow="1" w:lastRow="0" w:firstColumn="1" w:lastColumn="0" w:noHBand="0" w:noVBand="1"/>
+        <w:tblLook w:val="0000" w:firstRow="0" w:lastRow="0" w:firstColumn="0" w:lastColumn="0" w:noHBand="0" w:noVBand="0"/>
       </w:tblPr>
       <w:tblGrid>
         <w:gridCol w:w="720"/>
@@ -6744,7 +6023,6 @@
       <w:pPr>
         <w:pStyle w:val="Heading2"/>
       </w:pPr>
-      <w:bookmarkStart w:id="5" w:name="_Toc231153932"/>
       <w:r>
         <w:t xml:space="preserve">CRUD </w:t>
       </w:r>
@@ -6764,7 +6042,6 @@
       <w:r>
         <w:t xml:space="preserve"> Python</w:t>
       </w:r>
-      <w:bookmarkEnd w:id="5"/>
     </w:p>
     <w:p>
       <w:pPr>
@@ -6908,7 +6185,6 @@
       <w:pPr>
         <w:pStyle w:val="Heading3"/>
       </w:pPr>
-      <w:bookmarkStart w:id="6" w:name="_Toc231153933"/>
       <w:proofErr w:type="spellStart"/>
       <w:r>
         <w:t>Estructura</w:t>
@@ -6925,7 +6201,6 @@
       <w:r>
         <w:t xml:space="preserve"> CRUD</w:t>
       </w:r>
-      <w:bookmarkEnd w:id="6"/>
     </w:p>
     <w:p>
       <w:pPr>
@@ -7306,7 +6581,6 @@
       <w:pPr>
         <w:pStyle w:val="Heading3"/>
       </w:pPr>
-      <w:bookmarkStart w:id="7" w:name="_Toc231153934"/>
       <w:proofErr w:type="spellStart"/>
       <w:r>
         <w:t>Importación</w:t>
@@ -7323,7 +6597,6 @@
       <w:r>
         <w:t xml:space="preserve"> CSV / JSON</w:t>
       </w:r>
-      <w:bookmarkEnd w:id="7"/>
     </w:p>
     <w:p>
       <w:pPr>
@@ -7459,7 +6732,6 @@
       <w:pPr>
         <w:pStyle w:val="Heading3"/>
       </w:pPr>
-      <w:bookmarkStart w:id="8" w:name="_Toc231153935"/>
       <w:proofErr w:type="spellStart"/>
       <w:r>
         <w:t>Métricas</w:t>
@@ -7472,7 +6744,6 @@
       <w:r>
         <w:t>descriptivas</w:t>
       </w:r>
-      <w:bookmarkEnd w:id="8"/>
       <w:proofErr w:type="spellEnd"/>
     </w:p>
     <w:p>
@@ -7626,7 +6897,7 @@
           <w:left w:w="10" w:type="dxa"/>
           <w:right w:w="10" w:type="dxa"/>
         </w:tblCellMar>
-        <w:tblLook w:val="04A0" w:firstRow="1" w:lastRow="0" w:firstColumn="1" w:lastColumn="0" w:noHBand="0" w:noVBand="1"/>
+        <w:tblLook w:val="0000" w:firstRow="0" w:lastRow="0" w:firstColumn="0" w:lastColumn="0" w:noHBand="0" w:noVBand="0"/>
       </w:tblPr>
       <w:tblGrid>
         <w:gridCol w:w="2700"/>
@@ -8315,7 +7586,6 @@
       <w:pPr>
         <w:pStyle w:val="Heading2"/>
       </w:pPr>
-      <w:bookmarkStart w:id="9" w:name="_Toc231153936"/>
       <w:proofErr w:type="spellStart"/>
       <w:r>
         <w:t>Mejora</w:t>
@@ -8332,7 +7602,6 @@
       <w:r>
         <w:t>: UNIQUE Constraints</w:t>
       </w:r>
-      <w:bookmarkEnd w:id="9"/>
     </w:p>
     <w:p>
       <w:pPr>
@@ -8668,7 +7937,7 @@
           <w:left w:w="10" w:type="dxa"/>
           <w:right w:w="10" w:type="dxa"/>
         </w:tblCellMar>
-        <w:tblLook w:val="04A0" w:firstRow="1" w:lastRow="0" w:firstColumn="1" w:lastColumn="0" w:noHBand="0" w:noVBand="1"/>
+        <w:tblLook w:val="0000" w:firstRow="0" w:lastRow="0" w:firstColumn="0" w:lastColumn="0" w:noHBand="0" w:noVBand="0"/>
       </w:tblPr>
       <w:tblGrid>
         <w:gridCol w:w="2700"/>
@@ -9468,7 +8737,6 @@
       <w:pPr>
         <w:pStyle w:val="Heading1"/>
       </w:pPr>
-      <w:bookmarkStart w:id="10" w:name="_Toc231153937"/>
       <w:r>
         <w:t xml:space="preserve">Fase II: ORM Nativo </w:t>
       </w:r>
@@ -9480,13 +8748,11 @@
       <w:r>
         <w:t xml:space="preserve"> POO</w:t>
       </w:r>
-      <w:bookmarkEnd w:id="10"/>
     </w:p>
     <w:p>
       <w:pPr>
         <w:pStyle w:val="Heading2"/>
       </w:pPr>
-      <w:bookmarkStart w:id="11" w:name="_Toc231153938"/>
       <w:proofErr w:type="spellStart"/>
       <w:r>
         <w:t>Arquitectura</w:t>
@@ -9499,7 +8765,6 @@
       <w:r>
         <w:t>Solución</w:t>
       </w:r>
-      <w:bookmarkEnd w:id="11"/>
       <w:proofErr w:type="spellEnd"/>
     </w:p>
     <w:p>
@@ -9828,7 +9093,7 @@
           <w:left w:w="10" w:type="dxa"/>
           <w:right w:w="10" w:type="dxa"/>
         </w:tblCellMar>
-        <w:tblLook w:val="04A0" w:firstRow="1" w:lastRow="0" w:firstColumn="1" w:lastColumn="0" w:noHBand="0" w:noVBand="1"/>
+        <w:tblLook w:val="0000" w:firstRow="0" w:lastRow="0" w:firstColumn="0" w:lastColumn="0" w:noHBand="0" w:noVBand="0"/>
       </w:tblPr>
       <w:tblGrid>
         <w:gridCol w:w="1620"/>
@@ -10714,12 +9979,10 @@
       <w:pPr>
         <w:pStyle w:val="Heading2"/>
       </w:pPr>
-      <w:bookmarkStart w:id="12" w:name="_Toc231153939"/>
       <w:proofErr w:type="spellStart"/>
       <w:r>
         <w:t>DbContext</w:t>
       </w:r>
-      <w:bookmarkEnd w:id="12"/>
       <w:proofErr w:type="spellEnd"/>
     </w:p>
     <w:p>
@@ -11324,11 +10587,9 @@
       <w:pPr>
         <w:pStyle w:val="Heading2"/>
       </w:pPr>
-      <w:bookmarkStart w:id="13" w:name="_Toc231153940"/>
       <w:r>
         <w:t>Entities</w:t>
       </w:r>
-      <w:bookmarkEnd w:id="13"/>
     </w:p>
     <w:p>
       <w:pPr>
@@ -12014,11 +11275,9 @@
       <w:pPr>
         <w:pStyle w:val="Heading2"/>
       </w:pPr>
-      <w:bookmarkStart w:id="14" w:name="_Toc231153941"/>
       <w:r>
         <w:t>Repositories (List&lt;Entity&gt;)</w:t>
       </w:r>
-      <w:bookmarkEnd w:id="14"/>
     </w:p>
     <w:p>
       <w:pPr>
@@ -12917,11 +12176,9 @@
       <w:pPr>
         <w:pStyle w:val="Heading2"/>
       </w:pPr>
-      <w:bookmarkStart w:id="15" w:name="_Toc231153942"/>
       <w:r>
         <w:t>Controllers (MVC)</w:t>
       </w:r>
-      <w:bookmarkEnd w:id="15"/>
     </w:p>
     <w:p>
       <w:pPr>
@@ -13836,7 +13093,6 @@
       <w:pPr>
         <w:pStyle w:val="Heading2"/>
       </w:pPr>
-      <w:bookmarkStart w:id="16" w:name="_Toc231153943"/>
       <w:proofErr w:type="spellStart"/>
       <w:r>
         <w:t>Flujo</w:t>
@@ -13865,7 +13121,6 @@
       <w:r>
         <w:t>Operación</w:t>
       </w:r>
-      <w:bookmarkEnd w:id="16"/>
       <w:proofErr w:type="spellEnd"/>
     </w:p>
     <w:p>
@@ -13978,7 +13233,7 @@
           <w:left w:w="10" w:type="dxa"/>
           <w:right w:w="10" w:type="dxa"/>
         </w:tblCellMar>
-        <w:tblLook w:val="04A0" w:firstRow="1" w:lastRow="0" w:firstColumn="1" w:lastColumn="0" w:noHBand="0" w:noVBand="1"/>
+        <w:tblLook w:val="0000" w:firstRow="0" w:lastRow="0" w:firstColumn="0" w:lastColumn="0" w:noHBand="0" w:noVBand="0"/>
       </w:tblPr>
       <w:tblGrid>
         <w:gridCol w:w="900"/>
@@ -14929,12 +14184,10 @@
       <w:pPr>
         <w:pStyle w:val="Heading1"/>
       </w:pPr>
-      <w:bookmarkStart w:id="17" w:name="_Toc231153944"/>
       <w:proofErr w:type="spellStart"/>
       <w:r>
         <w:t>Resultados</w:t>
       </w:r>
-      <w:bookmarkEnd w:id="17"/>
       <w:proofErr w:type="spellEnd"/>
     </w:p>
     <w:p>
@@ -15433,7 +14686,6 @@
       <w:pPr>
         <w:pStyle w:val="Heading2"/>
       </w:pPr>
-      <w:bookmarkStart w:id="18" w:name="_Toc231153945"/>
       <w:proofErr w:type="spellStart"/>
       <w:r>
         <w:t>Estructura</w:t>
@@ -15442,7 +14694,6 @@
       <w:r>
         <w:t xml:space="preserve"> del Proyecto</w:t>
       </w:r>
-      <w:bookmarkEnd w:id="18"/>
     </w:p>
     <w:p>
       <w:pPr>
@@ -15464,7 +14715,7 @@
           <w:left w:w="10" w:type="dxa"/>
           <w:right w:w="10" w:type="dxa"/>
         </w:tblCellMar>
-        <w:tblLook w:val="04A0" w:firstRow="1" w:lastRow="0" w:firstColumn="1" w:lastColumn="0" w:noHBand="0" w:noVBand="1"/>
+        <w:tblLook w:val="0000" w:firstRow="0" w:lastRow="0" w:firstColumn="0" w:lastColumn="0" w:noHBand="0" w:noVBand="0"/>
       </w:tblPr>
       <w:tblGrid>
         <w:gridCol w:w="3060"/>
@@ -16844,7 +16095,6 @@
       <w:pPr>
         <w:pStyle w:val="Heading1"/>
       </w:pPr>
-      <w:bookmarkStart w:id="19" w:name="_Toc231153946"/>
       <w:proofErr w:type="spellStart"/>
       <w:r>
         <w:t>Conclusiones</w:t>
@@ -16857,7 +16107,6 @@
       <w:r>
         <w:t>Recomendaciones</w:t>
       </w:r>
-      <w:bookmarkEnd w:id="19"/>
       <w:proofErr w:type="spellEnd"/>
     </w:p>
     <w:p>
@@ -17615,12 +16864,10 @@
       <w:pPr>
         <w:pStyle w:val="Heading1"/>
       </w:pPr>
-      <w:bookmarkStart w:id="20" w:name="_Toc231153947"/>
       <w:proofErr w:type="spellStart"/>
       <w:r>
         <w:t>Referencias</w:t>
       </w:r>
-      <w:bookmarkEnd w:id="20"/>
       <w:proofErr w:type="spellEnd"/>
     </w:p>
     <w:p>
@@ -17628,7 +16875,7 @@
         <w:spacing w:line="480" w:lineRule="auto"/>
         <w:ind w:left="720" w:hanging="720"/>
       </w:pPr>
-      <w:bookmarkStart w:id="21" w:name="ref_bayer_2012"/>
+      <w:bookmarkStart w:id="0" w:name="ref_bayer_2012"/>
       <w:r>
         <w:t xml:space="preserve">Bayer, M. (2012). </w:t>
       </w:r>
@@ -17674,14 +16921,14 @@
           <w:t>https://aosabook.org/en/sqlalchemy.html</w:t>
         </w:r>
       </w:hyperlink>
-      <w:bookmarkEnd w:id="21"/>
+      <w:bookmarkEnd w:id="0"/>
     </w:p>
     <w:p>
       <w:pPr>
         <w:spacing w:line="480" w:lineRule="auto"/>
         <w:ind w:left="720" w:hanging="720"/>
       </w:pPr>
-      <w:bookmarkStart w:id="22" w:name="ref_fowler_2002"/>
+      <w:bookmarkStart w:id="1" w:name="ref_fowler_2002"/>
       <w:r>
         <w:t xml:space="preserve">Fowler, M. (2002). </w:t>
       </w:r>
@@ -17695,14 +16942,14 @@
       <w:r>
         <w:t>. Addison-Wesley.</w:t>
       </w:r>
-      <w:bookmarkEnd w:id="22"/>
+      <w:bookmarkEnd w:id="1"/>
     </w:p>
     <w:p>
       <w:pPr>
         <w:spacing w:line="480" w:lineRule="auto"/>
         <w:ind w:left="720" w:hanging="720"/>
       </w:pPr>
-      <w:bookmarkStart w:id="23" w:name="ref_leff_2001"/>
+      <w:bookmarkStart w:id="2" w:name="ref_leff_2001"/>
       <w:r>
         <w:t xml:space="preserve">Leff, A., &amp; Rayfield, J. T. (2001). Web-application development using the Model/View/Controller design pattern. En </w:t>
       </w:r>
@@ -17724,14 +16971,14 @@
           <w:t>https://doi.org/10.1109/EDOC.2001.950428</w:t>
         </w:r>
       </w:hyperlink>
-      <w:bookmarkEnd w:id="23"/>
+      <w:bookmarkEnd w:id="2"/>
     </w:p>
     <w:p>
       <w:pPr>
         <w:spacing w:line="480" w:lineRule="auto"/>
         <w:ind w:left="720" w:hanging="720"/>
       </w:pPr>
-      <w:bookmarkStart w:id="24" w:name="ref_oracle_2023"/>
+      <w:bookmarkStart w:id="3" w:name="ref_oracle_2023"/>
       <w:r>
         <w:t xml:space="preserve">Oracle Corporation. (2023). </w:t>
       </w:r>
@@ -17753,14 +17000,14 @@
           <w:t>https://dev.mysql.com/doc/sakila/en/</w:t>
         </w:r>
       </w:hyperlink>
-      <w:bookmarkEnd w:id="24"/>
+      <w:bookmarkEnd w:id="3"/>
     </w:p>
     <w:p>
       <w:pPr>
         <w:spacing w:line="480" w:lineRule="auto"/>
         <w:ind w:left="720" w:hanging="720"/>
       </w:pPr>
-      <w:bookmarkStart w:id="25" w:name="ref_ramakrishnan_2003"/>
+      <w:bookmarkStart w:id="4" w:name="ref_ramakrishnan_2003"/>
       <w:r>
         <w:t xml:space="preserve">Ramakrishnan, R., &amp; Gehrke, J. (2003). </w:t>
       </w:r>
@@ -17774,14 +17021,14 @@
       <w:r>
         <w:t xml:space="preserve"> (3ra ed.). McGraw-Hill.</w:t>
       </w:r>
-      <w:bookmarkEnd w:id="25"/>
+      <w:bookmarkEnd w:id="4"/>
     </w:p>
     <w:p>
       <w:pPr>
         <w:spacing w:line="480" w:lineRule="auto"/>
         <w:ind w:left="720" w:hanging="720"/>
       </w:pPr>
-      <w:bookmarkStart w:id="26" w:name="ref_torres_2017"/>
+      <w:bookmarkStart w:id="5" w:name="ref_torres_2017"/>
       <w:r>
         <w:t xml:space="preserve">Torres, A., Galante, R., Pimenta, M. S., &amp; Martins, A. J. B. (2017). Twenty years of object-relational mapping: A survey on patterns, solutions, and their implications on application design. </w:t>
       </w:r>
@@ -17803,14 +17050,19 @@
           <w:t>https://doi.org/10.1016/j.infsof.2016.09.009</w:t>
         </w:r>
       </w:hyperlink>
-      <w:bookmarkEnd w:id="26"/>
+      <w:bookmarkEnd w:id="5"/>
     </w:p>
     <w:p>
       <w:pPr>
         <w:pStyle w:val="Heading1"/>
       </w:pPr>
-      <w:bookmarkStart w:id="27" w:name="_Toc231153948"/>
-      <w:r>
+    </w:p>
+    <w:p>
+      <w:pPr>
+        <w:pStyle w:val="Heading1"/>
+      </w:pPr>
+      <w:r>
+        <w:lastRenderedPageBreak/>
         <w:t xml:space="preserve">Anexo A: </w:t>
       </w:r>
       <w:proofErr w:type="spellStart"/>
@@ -17821,7 +17073,6 @@
       <w:r>
         <w:t xml:space="preserve"> y Código Fuente</w:t>
       </w:r>
-      <w:bookmarkEnd w:id="27"/>
     </w:p>
     <w:p>
       <w:pPr>
@@ -17830,7 +17081,6 @@
         <w:jc w:val="both"/>
       </w:pPr>
       <w:r>
-        <w:lastRenderedPageBreak/>
         <w:t xml:space="preserve">El </w:t>
       </w:r>
       <w:proofErr w:type="spellStart"/>
@@ -17908,7 +17158,7 @@
           <w:rPr>
             <w:rStyle w:val="Hyperlink"/>
           </w:rPr>
-          <w:t>https://github.com/[usuario]/caso-practico-2-sakila</w:t>
+          <w:t>https://github.com/mudstart/caso_practico_2</w:t>
         </w:r>
       </w:hyperlink>
     </w:p>
@@ -18038,7 +17288,6 @@
       <w:pPr>
         <w:pStyle w:val="Heading1"/>
       </w:pPr>
-      <w:bookmarkStart w:id="28" w:name="_Toc231153949"/>
       <w:r>
         <w:t xml:space="preserve">Anexo B: </w:t>
       </w:r>
@@ -18054,7 +17303,6 @@
       <w:r>
         <w:t>Ejecución</w:t>
       </w:r>
-      <w:bookmarkEnd w:id="28"/>
       <w:proofErr w:type="spellEnd"/>
     </w:p>
     <w:p>
@@ -18598,7 +17846,7 @@
       <w:rPr>
         <w:noProof/>
       </w:rPr>
-      <w:t>x</w:t>
+      <w:t>i</w:t>
     </w:r>
     <w:r>
       <w:fldChar w:fldCharType="end"/>
@@ -18626,7 +17874,7 @@
       <w:rPr>
         <w:noProof/>
       </w:rPr>
-      <w:t>10</w:t>
+      <w:t>1</w:t>
     </w:r>
     <w:r>
       <w:fldChar w:fldCharType="end"/>
@@ -18638,10 +17886,10 @@
 <file path=word/numbering.xml><?xml version="1.0" encoding="utf-8"?>
 <w:numbering xmlns:wpc="http://schemas.microsoft.com/office/word/2010/wordprocessingCanvas" xmlns:cx="http://schemas.microsoft.com/office/drawing/2014/chartex" xmlns:cx1="http://schemas.microsoft.com/office/drawing/2015/9/8/chartex" xmlns:cx2="http://schemas.microsoft.com/office/drawing/2015/10/21/chartex" xmlns:cx3="http://schemas.microsoft.com/office/drawing/2016/5/9/chartex" xmlns:cx4="http://schemas.microsoft.com/office/drawing/2016/5/10/chartex" xmlns:cx5="http://schemas.microsoft.com/office/drawing/2016/5/11/chartex" xmlns:cx6="http://schemas.microsoft.com/office/drawing/2016/5/12/chartex" xmlns:cx7="http://schemas.microsoft.com/office/drawing/2016/5/13/chartex" xmlns:cx8="http://schemas.microsoft.com/office/drawing/2016/5/14/chartex" xmlns:mc="http://schemas.openxmlformats.org/markup-compatibility/2006" xmlns:aink="http://schemas.microsoft.com/office/drawing/2016/ink" xmlns:am3d="http://schemas.microsoft.com/office/drawing/2017/model3d" xmlns:o="urn:schemas-microsoft-com:office:office" xmlns:oel="http://schemas.microsoft.com/office/2019/extlst" xmlns:r="http://schemas.openxmlformats.org/officeDocument/2006/relationships" xmlns:m="http://schemas.openxmlformats.org/officeDocument/2006/math" xmlns:v="urn:schemas-microsoft-com:vml" xmlns:wp14="http://schemas.microsoft.com/office/word/2010/wordprocessingDrawing" xmlns:wp="http://schemas.openxmlformats.org/drawingml/2006/wordprocessingDrawing" xmlns:w10="urn:schemas-microsoft-com:office:word" xmlns:w="http://schemas.openxmlformats.org/wordprocessingml/2006/main" xmlns:w14="http://schemas.microsoft.com/office/word/2010/wordml" xmlns:w15="http://schemas.microsoft.com/office/word/2012/wordml" xmlns:w16cex="http://schemas.microsoft.com/office/word/2018/wordml/cex" xmlns:w16cid="http://schemas.microsoft.com/office/word/2016/wordml/cid" xmlns:w16="http://schemas.microsoft.com/office/word/2018/wordml" xmlns:w16du="http://schemas.microsoft.com/office/word/2023/wordml/word16du" xmlns:w16sdtdh="http://schemas.microsoft.com/office/word/2020/wordml/sdtdatahash" xmlns:w16sdtfl="http://schemas.microsoft.com/office/word/2024/wordml/sdtformatlock" xmlns:w16se="http://schemas.microsoft.com/office/word/2015/wordml/symex" xmlns:wpg="http://schemas.microsoft.com/office/word/2010/wordprocessingGroup" xmlns:wpi="http://schemas.microsoft.com/office/word/2010/wordprocessingInk" xmlns:wne="http://schemas.microsoft.com/office/word/2006/wordml" xmlns:wps="http://schemas.microsoft.com/office/word/2010/wordprocessingShape" mc:Ignorable="w14 w15 w16se w16cid w16 w16cex w16sdtdh w16sdtfl w16du wp14">
   <w:abstractNum w:abstractNumId="0" w15:restartNumberingAfterBreak="0">
-    <w:nsid w:val="63516CB8"/>
+    <w:nsid w:val="4F8858EC"/>
     <w:multiLevelType w:val="hybridMultilevel"/>
-    <w:tmpl w:val="375ABEDA"/>
-    <w:lvl w:ilvl="0" w:tplc="3F26E10E">
+    <w:tmpl w:val="5B4E2054"/>
+    <w:lvl w:ilvl="0" w:tplc="8E4A30EE">
       <w:start w:val="1"/>
       <w:numFmt w:val="bullet"/>
       <w:lvlText w:val="●"/>
@@ -18650,7 +17898,7 @@
         <w:ind w:left="720" w:hanging="360"/>
       </w:pPr>
     </w:lvl>
-    <w:lvl w:ilvl="1" w:tplc="794A9EF2">
+    <w:lvl w:ilvl="1" w:tplc="8F701D60">
       <w:start w:val="1"/>
       <w:numFmt w:val="bullet"/>
       <w:lvlText w:val="○"/>
@@ -18659,7 +17907,7 @@
         <w:ind w:left="1440" w:hanging="360"/>
       </w:pPr>
     </w:lvl>
-    <w:lvl w:ilvl="2" w:tplc="22EAC6AA">
+    <w:lvl w:ilvl="2" w:tplc="4DDC5AA2">
       <w:start w:val="1"/>
       <w:numFmt w:val="bullet"/>
       <w:lvlText w:val="■"/>
@@ -18668,7 +17916,7 @@
         <w:ind w:left="2160" w:hanging="360"/>
       </w:pPr>
     </w:lvl>
-    <w:lvl w:ilvl="3" w:tplc="1FE61D00">
+    <w:lvl w:ilvl="3" w:tplc="7E701366">
       <w:start w:val="1"/>
       <w:numFmt w:val="bullet"/>
       <w:lvlText w:val="●"/>
@@ -18677,7 +17925,7 @@
         <w:ind w:left="2880" w:hanging="360"/>
       </w:pPr>
     </w:lvl>
-    <w:lvl w:ilvl="4" w:tplc="FC56F0F8">
+    <w:lvl w:ilvl="4" w:tplc="A4EA305A">
       <w:start w:val="1"/>
       <w:numFmt w:val="bullet"/>
       <w:lvlText w:val="○"/>
@@ -18686,7 +17934,7 @@
         <w:ind w:left="3600" w:hanging="360"/>
       </w:pPr>
     </w:lvl>
-    <w:lvl w:ilvl="5" w:tplc="117C10B4">
+    <w:lvl w:ilvl="5" w:tplc="5E3ED204">
       <w:start w:val="1"/>
       <w:numFmt w:val="bullet"/>
       <w:lvlText w:val="■"/>
@@ -18695,7 +17943,7 @@
         <w:ind w:left="4320" w:hanging="360"/>
       </w:pPr>
     </w:lvl>
-    <w:lvl w:ilvl="6" w:tplc="179ACCB8">
+    <w:lvl w:ilvl="6" w:tplc="7C646B6C">
       <w:start w:val="1"/>
       <w:numFmt w:val="bullet"/>
       <w:lvlText w:val="●"/>
@@ -18704,7 +17952,7 @@
         <w:ind w:left="5040" w:hanging="360"/>
       </w:pPr>
     </w:lvl>
-    <w:lvl w:ilvl="7" w:tplc="3EFE17C8">
+    <w:lvl w:ilvl="7" w:tplc="6D4C70CC">
       <w:start w:val="1"/>
       <w:numFmt w:val="bullet"/>
       <w:lvlText w:val="●"/>
@@ -18713,7 +17961,7 @@
         <w:ind w:left="5760" w:hanging="360"/>
       </w:pPr>
     </w:lvl>
-    <w:lvl w:ilvl="8" w:tplc="C0F4C536">
+    <w:lvl w:ilvl="8" w:tplc="CA801EF8">
       <w:start w:val="1"/>
       <w:numFmt w:val="bullet"/>
       <w:lvlText w:val="●"/>
@@ -18723,7 +17971,7 @@
       </w:pPr>
     </w:lvl>
   </w:abstractNum>
-  <w:num w:numId="1" w16cid:durableId="180777734">
+  <w:num w:numId="1" w16cid:durableId="1628123938">
     <w:abstractNumId w:val="0"/>
     <w:lvlOverride w:ilvl="0">
       <w:startOverride w:val="1"/>
@@ -19331,44 +18579,6 @@
       <w:szCs w:val="20"/>
     </w:rPr>
   </w:style>
-  <w:style w:type="paragraph" w:styleId="TOC1">
-    <w:name w:val="toc 1"/>
-    <w:basedOn w:val="Normal"/>
-    <w:next w:val="Normal"/>
-    <w:autoRedefine/>
-    <w:uiPriority w:val="39"/>
-    <w:unhideWhenUsed/>
-    <w:rsid w:val="001F3595"/>
-    <w:pPr>
-      <w:spacing w:after="100"/>
-    </w:pPr>
-  </w:style>
-  <w:style w:type="paragraph" w:styleId="TOC2">
-    <w:name w:val="toc 2"/>
-    <w:basedOn w:val="Normal"/>
-    <w:next w:val="Normal"/>
-    <w:autoRedefine/>
-    <w:uiPriority w:val="39"/>
-    <w:unhideWhenUsed/>
-    <w:rsid w:val="001F3595"/>
-    <w:pPr>
-      <w:spacing w:after="100"/>
-      <w:ind w:left="240"/>
-    </w:pPr>
-  </w:style>
-  <w:style w:type="paragraph" w:styleId="TOC3">
-    <w:name w:val="toc 3"/>
-    <w:basedOn w:val="Normal"/>
-    <w:next w:val="Normal"/>
-    <w:autoRedefine/>
-    <w:uiPriority w:val="39"/>
-    <w:unhideWhenUsed/>
-    <w:rsid w:val="001F3595"/>
-    <w:pPr>
-      <w:spacing w:after="100"/>
-      <w:ind w:left="480"/>
-    </w:pPr>
-  </w:style>
 </w:styles>
 </file>
 

</xml_diff>